<commit_message>
docs: generate formal project report formatted exactly like 002_040.docx
</commit_message>
<xml_diff>
--- a/ecofinsai_report.docx
+++ b/ecofinsai_report.docx
@@ -4,36 +4,48 @@
   <w:body>
     <w:p>
       <w:pPr>
-        <w:spacing w:before="240" w:after="80"/>
+        <w:spacing w:before="280" w:after="40"/>
+        <w:jc w:val="center"/>
       </w:pPr>
       <w:r>
         <w:rPr>
-          <w:rFonts w:ascii="Calibri" w:hAnsi="Calibri"/>
           <w:b/>
-          <w:color w:val="0F172A"/>
-          <w:sz w:val="48"/>
+          <w:color w:val="000000"/>
+          <w:sz w:val="60"/>
         </w:rPr>
-        <w:t>EcoFinOps AI: Comprehensive Technical Project Report</w:t>
+        <w:t>CLOUD COMPUTING PROJECT</w:t>
       </w:r>
     </w:p>
     <w:p>
       <w:pPr>
-        <w:spacing w:after="280"/>
+        <w:spacing w:after="320"/>
+        <w:jc w:val="center"/>
       </w:pPr>
       <w:r>
         <w:rPr>
-          <w:i/>
-          <w:color w:val="0E7490"/>
-          <w:sz w:val="26"/>
+          <w:color w:val="3C3C3C"/>
+          <w:sz w:val="32"/>
         </w:rPr>
-        <w:t>An Agentic Multi-Agent Framework for Cloud FinOps, Scope 2 Carbon Intelligence, and Predictive Serverless Pre-Warming</w:t>
+        <w:t>Project Documentation</w:t>
+      </w:r>
+    </w:p>
+    <w:p>
+      <w:pPr>
+        <w:spacing w:after="80"/>
+      </w:pPr>
+      <w:r>
+        <w:rPr>
+          <w:b/>
+          <w:sz w:val="22"/>
+        </w:rPr>
+        <w:t>Submitted by</w:t>
       </w:r>
     </w:p>
     <w:tbl>
       <w:tblPr>
+        <w:tblStyle w:val="TableGrid"/>
         <w:tblW w:type="auto" w:w="0"/>
         <w:jc w:val="center"/>
-        <w:tblLayout w:type="fixed"/>
         <w:tblLook w:firstColumn="1" w:firstRow="1" w:lastColumn="0" w:lastRow="0" w:noHBand="0" w:noVBand="1" w:val="04A0"/>
       </w:tblPr>
       <w:tblGrid>
@@ -43,50 +55,27 @@
       <w:tr>
         <w:tc>
           <w:tcPr>
-            <w:tcW w:type="dxa" w:w="3456"/>
-            <w:shd w:fill="F8FAFC"/>
-            <w:tcMar>
-              <w:top w:w="60" w:type="dxa"/>
-              <w:bottom w:w="60" w:type="dxa"/>
-              <w:left w:w="100" w:type="dxa"/>
-              <w:right w:w="100" w:type="dxa"/>
-            </w:tcMar>
+            <w:tcW w:type="dxa" w:w="4320"/>
           </w:tcPr>
           <w:p>
-            <w:pPr>
-              <w:spacing w:after="40"/>
-            </w:pPr>
             <w:r>
               <w:rPr>
                 <w:b/>
-                <w:color w:val="475569"/>
-                <w:sz w:val="19"/>
               </w:rPr>
-              <w:t>Authors / Research Attribution:</w:t>
+              <w:t>Name</w:t>
             </w:r>
           </w:p>
         </w:tc>
         <w:tc>
           <w:tcPr>
-            <w:tcW w:type="dxa" w:w="5904"/>
-            <w:shd w:fill="F1F5F9"/>
-            <w:tcMar>
-              <w:top w:w="60" w:type="dxa"/>
-              <w:bottom w:w="60" w:type="dxa"/>
-              <w:left w:w="100" w:type="dxa"/>
-              <w:right w:w="100" w:type="dxa"/>
-            </w:tcMar>
+            <w:tcW w:type="dxa" w:w="4320"/>
           </w:tcPr>
           <w:p>
-            <w:pPr>
-              <w:spacing w:after="40"/>
-            </w:pPr>
             <w:r>
               <w:rPr>
-                <w:color w:val="0F172A"/>
-                <w:sz w:val="19"/>
+                <w:b/>
               </w:rPr>
-              <w:t>Kavitha P, Jithu S, Devika A P</w:t>
+              <w:t>Roll Number</w:t>
             </w:r>
           </w:p>
         </w:tc>
@@ -94,50 +83,21 @@
       <w:tr>
         <w:tc>
           <w:tcPr>
-            <w:tcW w:type="dxa" w:w="3456"/>
-            <w:shd w:fill="F8FAFC"/>
-            <w:tcMar>
-              <w:top w:w="60" w:type="dxa"/>
-              <w:bottom w:w="60" w:type="dxa"/>
-              <w:left w:w="100" w:type="dxa"/>
-              <w:right w:w="100" w:type="dxa"/>
-            </w:tcMar>
+            <w:tcW w:type="dxa" w:w="4320"/>
           </w:tcPr>
           <w:p>
-            <w:pPr>
-              <w:spacing w:after="40"/>
-            </w:pPr>
             <w:r>
-              <w:rPr>
-                <w:b/>
-                <w:color w:val="475569"/>
-                <w:sz w:val="19"/>
-              </w:rPr>
-              <w:t>Platform Version &amp; Release:</w:t>
+              <w:t>Jithu S</w:t>
             </w:r>
           </w:p>
         </w:tc>
         <w:tc>
           <w:tcPr>
-            <w:tcW w:type="dxa" w:w="5904"/>
-            <w:shd w:fill="F1F5F9"/>
-            <w:tcMar>
-              <w:top w:w="60" w:type="dxa"/>
-              <w:bottom w:w="60" w:type="dxa"/>
-              <w:left w:w="100" w:type="dxa"/>
-              <w:right w:w="100" w:type="dxa"/>
-            </w:tcMar>
+            <w:tcW w:type="dxa" w:w="4320"/>
           </w:tcPr>
           <w:p>
-            <w:pPr>
-              <w:spacing w:after="40"/>
-            </w:pPr>
             <w:r>
-              <w:rPr>
-                <w:color w:val="0F172A"/>
-                <w:sz w:val="19"/>
-              </w:rPr>
-              <w:t>v1.0.0 Enterprise Production Release (Dual Runtime)</w:t>
+              <w:t>CB.PS.I5DAS23157</w:t>
             </w:r>
           </w:p>
         </w:tc>
@@ -145,50 +105,21 @@
       <w:tr>
         <w:tc>
           <w:tcPr>
-            <w:tcW w:type="dxa" w:w="3456"/>
-            <w:shd w:fill="F8FAFC"/>
-            <w:tcMar>
-              <w:top w:w="60" w:type="dxa"/>
-              <w:bottom w:w="60" w:type="dxa"/>
-              <w:left w:w="100" w:type="dxa"/>
-              <w:right w:w="100" w:type="dxa"/>
-            </w:tcMar>
+            <w:tcW w:type="dxa" w:w="4320"/>
           </w:tcPr>
           <w:p>
-            <w:pPr>
-              <w:spacing w:after="40"/>
-            </w:pPr>
             <w:r>
-              <w:rPr>
-                <w:b/>
-                <w:color w:val="475569"/>
-                <w:sz w:val="19"/>
-              </w:rPr>
-              <w:t>Core Technology Stack:</w:t>
+              <w:t>Devika A P</w:t>
             </w:r>
           </w:p>
         </w:tc>
         <w:tc>
           <w:tcPr>
-            <w:tcW w:type="dxa" w:w="5904"/>
-            <w:shd w:fill="F1F5F9"/>
-            <w:tcMar>
-              <w:top w:w="60" w:type="dxa"/>
-              <w:bottom w:w="60" w:type="dxa"/>
-              <w:left w:w="100" w:type="dxa"/>
-              <w:right w:w="100" w:type="dxa"/>
-            </w:tcMar>
+            <w:tcW w:type="dxa" w:w="4320"/>
           </w:tcPr>
           <w:p>
-            <w:pPr>
-              <w:spacing w:after="40"/>
-            </w:pPr>
             <w:r>
-              <w:rPr>
-                <w:color w:val="0F172A"/>
-                <w:sz w:val="19"/>
-              </w:rPr>
-              <w:t>NitroStack MCP Framework + Python Scientific ML + Next.js Widgets</w:t>
+              <w:t>CB.PS.I5DAS23048</w:t>
             </w:r>
           </w:p>
         </w:tc>
@@ -196,50 +127,21 @@
       <w:tr>
         <w:tc>
           <w:tcPr>
-            <w:tcW w:type="dxa" w:w="3456"/>
-            <w:shd w:fill="F8FAFC"/>
-            <w:tcMar>
-              <w:top w:w="60" w:type="dxa"/>
-              <w:bottom w:w="60" w:type="dxa"/>
-              <w:left w:w="100" w:type="dxa"/>
-              <w:right w:w="100" w:type="dxa"/>
-            </w:tcMar>
+            <w:tcW w:type="dxa" w:w="4320"/>
           </w:tcPr>
           <w:p>
-            <w:pPr>
-              <w:spacing w:after="40"/>
-            </w:pPr>
             <w:r>
-              <w:rPr>
-                <w:b/>
-                <w:color w:val="475569"/>
-                <w:sz w:val="19"/>
-              </w:rPr>
-              <w:t>Publication Benchmark Calibration:</w:t>
+              <w:t>Kavitha P</w:t>
             </w:r>
           </w:p>
         </w:tc>
         <w:tc>
           <w:tcPr>
-            <w:tcW w:type="dxa" w:w="5904"/>
-            <w:shd w:fill="F1F5F9"/>
-            <w:tcMar>
-              <w:top w:w="60" w:type="dxa"/>
-              <w:bottom w:w="60" w:type="dxa"/>
-              <w:left w:w="100" w:type="dxa"/>
-              <w:right w:w="100" w:type="dxa"/>
-            </w:tcMar>
+            <w:tcW w:type="dxa" w:w="4320"/>
           </w:tcPr>
           <w:p>
-            <w:pPr>
-              <w:spacing w:after="40"/>
-            </w:pPr>
             <w:r>
-              <w:rPr>
-                <w:color w:val="0F172A"/>
-                <w:sz w:val="19"/>
-              </w:rPr>
-              <w:t>IEEE Conference 2026 Research Calibration &amp; Azure Functions 2019 Trace</w:t>
+              <w:t>Faculty / Co-Author</w:t>
             </w:r>
           </w:p>
         </w:tc>
@@ -247,74 +149,78 @@
     </w:tbl>
     <w:p>
       <w:pPr>
-        <w:spacing w:after="240"/>
+        <w:spacing w:after="0" w:before="0"/>
       </w:pPr>
     </w:p>
     <w:p>
       <w:pPr>
-        <w:keepNext/>
-        <w:spacing w:before="360" w:after="120"/>
+        <w:spacing w:after="80"/>
       </w:pPr>
       <w:r>
         <w:rPr>
-          <w:rFonts w:ascii="Calibri" w:hAnsi="Calibri"/>
           <w:b/>
-          <w:color w:val="0F172A"/>
-          <w:sz w:val="32"/>
+          <w:sz w:val="22"/>
         </w:rPr>
-        <w:t>1. Executive Summary &amp; Problem Context</w:t>
-      </w:r>
-    </w:p>
-    <w:p>
-      <w:r>
-        <w:t>Modern cloud computing architectures are increasingly complex, characterized by heterogeneous multi-cloud deployments (AWS, GCP, Azure), high-frequency serverless invocations, and dynamic containerized workloads. Consequently, organizations face three compounding operational challenges: uncontrollable financial waste, mounting environmental impacts (Scope 2 GHG emissions), and catastrophic latency degradation in serverless environments caused by cold starts.</w:t>
-      </w:r>
-    </w:p>
-    <w:p>
-      <w:r>
-        <w:t>EcoFinOps AI addresses these three pillars through a unified agentic platform. Rather than relying on static dashboards or heuristic scripts, EcoFinOps AI deploys a coordinated swarm of 12 specialized autonomous agents governed by the Model Context Protocol (MCP). The platform achieves autonomous cloud spend intelligence, software-modeled carbon optimization, and predictive serverless pre-warming that empirically eliminates 100% of cold starts.</w:t>
+        <w:t>Projects Covered</w:t>
       </w:r>
     </w:p>
     <w:tbl>
       <w:tblPr>
+        <w:tblStyle w:val="TableGrid"/>
         <w:tblW w:type="auto" w:w="0"/>
         <w:jc w:val="center"/>
         <w:tblLook w:firstColumn="1" w:firstRow="1" w:lastColumn="0" w:lastRow="0" w:noHBand="0" w:noVBand="1" w:val="04A0"/>
       </w:tblPr>
       <w:tblGrid>
-        <w:gridCol w:w="9360"/>
+        <w:gridCol w:w="4680"/>
+        <w:gridCol w:w="4680"/>
       </w:tblGrid>
       <w:tr>
         <w:tc>
           <w:tcPr>
-            <w:tcW w:type="dxa" w:w="9360"/>
-            <w:shd w:fill="F0FDF4"/>
-            <w:tcMar>
-              <w:top w:w="120" w:type="dxa"/>
-              <w:bottom w:w="120" w:type="dxa"/>
-              <w:left w:w="180" w:type="dxa"/>
-              <w:right w:w="180" w:type="dxa"/>
-            </w:tcMar>
+            <w:tcW w:type="dxa" w:w="3600"/>
           </w:tcPr>
           <w:p>
-            <w:pPr>
-              <w:spacing w:after="40"/>
-            </w:pPr>
             <w:r>
               <w:rPr>
                 <w:b/>
-                <w:color w:val="047857"/>
-                <w:sz w:val="20"/>
               </w:rPr>
-              <w:t>🛡️  GOVERNANCE &amp; TRUST CORE</w:t>
-              <w:br/>
+              <w:t>Project</w:t>
             </w:r>
+          </w:p>
+        </w:tc>
+        <w:tc>
+          <w:tcPr>
+            <w:tcW w:type="dxa" w:w="5040"/>
+          </w:tcPr>
+          <w:p>
             <w:r>
               <w:rPr>
-                <w:color w:val="0F172A"/>
-                <w:sz w:val="20"/>
+                <w:b/>
               </w:rPr>
-              <w:t>EcoFinOps AI is built under a strict Zero-Mutation Read-Only Security Standard (Agent 11). All calculations undergo deterministic mathematical verification (Agent 09), ensuring zero cloud mutations occur without explicit authorization and prohibiting false or exaggerated savings claims.</w:t>
+              <w:t>Live Website</w:t>
+            </w:r>
+          </w:p>
+        </w:tc>
+      </w:tr>
+      <w:tr>
+        <w:tc>
+          <w:tcPr>
+            <w:tcW w:type="dxa" w:w="3600"/>
+          </w:tcPr>
+          <w:p>
+            <w:r>
+              <w:t>1. EcoFinOps AI</w:t>
+            </w:r>
+          </w:p>
+        </w:tc>
+        <w:tc>
+          <w:tcPr>
+            <w:tcW w:type="dxa" w:w="5040"/>
+          </w:tcPr>
+          <w:p>
+            <w:r>
+              <w:t>https://ecofinops-ai.onrender.com/</w:t>
             </w:r>
           </w:p>
         </w:tc>
@@ -322,27 +228,326 @@
     </w:tbl>
     <w:p>
       <w:pPr>
-        <w:spacing w:after="80"/>
+        <w:spacing w:after="0" w:before="0"/>
       </w:pPr>
     </w:p>
     <w:p>
       <w:pPr>
-        <w:keepNext/>
-        <w:spacing w:before="360" w:after="120"/>
+        <w:pStyle w:val="Heading1"/>
+        <w:spacing w:before="280" w:after="120"/>
       </w:pPr>
       <w:r>
-        <w:rPr>
-          <w:rFonts w:ascii="Calibri" w:hAnsi="Calibri"/>
-          <w:b/>
-          <w:color w:val="0F172A"/>
-          <w:sz w:val="32"/>
-        </w:rPr>
-        <w:t>2. System Architecture &amp; Dual-Engine Hybrid Runtime</w:t>
+        <w:t>Project 1: EcoFinOps AI</w:t>
+      </w:r>
+    </w:p>
+    <w:p>
+      <w:pPr>
+        <w:pStyle w:val="Heading2"/>
+        <w:spacing w:before="160" w:after="80"/>
+      </w:pPr>
+      <w:r>
+        <w:t>1. Project Overview</w:t>
       </w:r>
     </w:p>
     <w:p>
       <w:r>
-        <w:t>The architecture is designed for production resiliency, combining asynchronous microservices with an analytical scientific pipeline:</w:t>
+        <w:t>EcoFinOps AI is an enterprise-grade Cloud FinOps, Carbon-Aware Workload Optimization, and Predictive Serverless Pre-Warming platform built on the NitroStack Model Context Protocol (MCP) framework and Machine Learning. It features 12 specialized autonomous agents that perform multi-cloud spend analysis, statistical time-series forecasting, unsupervised anomaly detection, Scope 2 GHG carbon emissions modeling, carbon-aware workload scheduling, rightsizing safeguards, and deterministic mathematical verification. Additionally, it incorporates IEEE 2026 conference research on multi-horizon XGBoost lookahead pre-warming, calibrated against 12.49 billion invocations from the Microsoft Azure Functions 2019 trace dataset.</w:t>
+      </w:r>
+    </w:p>
+    <w:p>
+      <w:pPr>
+        <w:pStyle w:val="Heading2"/>
+        <w:spacing w:before="160" w:after="80"/>
+      </w:pPr>
+      <w:r>
+        <w:t>2. Links</w:t>
+      </w:r>
+    </w:p>
+    <w:tbl>
+      <w:tblPr>
+        <w:tblStyle w:val="TableGrid"/>
+        <w:tblW w:type="auto" w:w="0"/>
+        <w:jc w:val="center"/>
+        <w:tblLook w:firstColumn="1" w:firstRow="1" w:lastColumn="0" w:lastRow="0" w:noHBand="0" w:noVBand="1" w:val="04A0"/>
+      </w:tblPr>
+      <w:tblGrid>
+        <w:gridCol w:w="4680"/>
+        <w:gridCol w:w="4680"/>
+      </w:tblGrid>
+      <w:tr>
+        <w:tc>
+          <w:tcPr>
+            <w:tcW w:type="dxa" w:w="3168"/>
+          </w:tcPr>
+          <w:p>
+            <w:r>
+              <w:rPr>
+                <w:b/>
+              </w:rPr>
+              <w:t>Website</w:t>
+            </w:r>
+          </w:p>
+        </w:tc>
+        <w:tc>
+          <w:tcPr>
+            <w:tcW w:type="dxa" w:w="5472"/>
+          </w:tcPr>
+          <w:p>
+            <w:r>
+              <w:t>https://ecofinops-ai.onrender.com/</w:t>
+            </w:r>
+          </w:p>
+        </w:tc>
+      </w:tr>
+      <w:tr>
+        <w:tc>
+          <w:tcPr>
+            <w:tcW w:type="dxa" w:w="3168"/>
+          </w:tcPr>
+          <w:p>
+            <w:r>
+              <w:rPr>
+                <w:b/>
+              </w:rPr>
+              <w:t>GitHub Repository</w:t>
+            </w:r>
+          </w:p>
+        </w:tc>
+        <w:tc>
+          <w:tcPr>
+            <w:tcW w:type="dxa" w:w="5472"/>
+          </w:tcPr>
+          <w:p>
+            <w:r>
+              <w:t>https://github.com/jithusunil30/cloud-computing-project</w:t>
+            </w:r>
+          </w:p>
+        </w:tc>
+      </w:tr>
+      <w:tr>
+        <w:tc>
+          <w:tcPr>
+            <w:tcW w:type="dxa" w:w="3168"/>
+          </w:tcPr>
+          <w:p>
+            <w:r>
+              <w:rPr>
+                <w:b/>
+              </w:rPr>
+              <w:t>Backend API / MCP Endpoint</w:t>
+            </w:r>
+          </w:p>
+        </w:tc>
+        <w:tc>
+          <w:tcPr>
+            <w:tcW w:type="dxa" w:w="5472"/>
+          </w:tcPr>
+          <w:p>
+            <w:r>
+              <w:t>https://ecofinops-ai.onrender.com/mcp</w:t>
+            </w:r>
+          </w:p>
+        </w:tc>
+      </w:tr>
+    </w:tbl>
+    <w:p>
+      <w:pPr>
+        <w:spacing w:after="0" w:before="0"/>
+      </w:pPr>
+    </w:p>
+    <w:p>
+      <w:pPr>
+        <w:pStyle w:val="Heading2"/>
+        <w:spacing w:before="160" w:after="80"/>
+      </w:pPr>
+      <w:r>
+        <w:t>3. Technologies Used</w:t>
+      </w:r>
+    </w:p>
+    <w:tbl>
+      <w:tblPr>
+        <w:tblStyle w:val="TableGrid"/>
+        <w:tblW w:type="auto" w:w="0"/>
+        <w:jc w:val="center"/>
+        <w:tblLook w:firstColumn="1" w:firstRow="1" w:lastColumn="0" w:lastRow="0" w:noHBand="0" w:noVBand="1" w:val="04A0"/>
+      </w:tblPr>
+      <w:tblGrid>
+        <w:gridCol w:w="4680"/>
+        <w:gridCol w:w="4680"/>
+      </w:tblGrid>
+      <w:tr>
+        <w:tc>
+          <w:tcPr>
+            <w:tcW w:type="dxa" w:w="3168"/>
+          </w:tcPr>
+          <w:p>
+            <w:r>
+              <w:rPr>
+                <w:b/>
+              </w:rPr>
+              <w:t>Layer</w:t>
+            </w:r>
+          </w:p>
+        </w:tc>
+        <w:tc>
+          <w:tcPr>
+            <w:tcW w:type="dxa" w:w="6192"/>
+          </w:tcPr>
+          <w:p>
+            <w:r>
+              <w:rPr>
+                <w:b/>
+              </w:rPr>
+              <w:t>Technologies</w:t>
+            </w:r>
+          </w:p>
+        </w:tc>
+      </w:tr>
+      <w:tr>
+        <w:tc>
+          <w:tcPr>
+            <w:tcW w:type="dxa" w:w="3168"/>
+          </w:tcPr>
+          <w:p>
+            <w:r>
+              <w:t>Frontend &amp; Web Portal</w:t>
+            </w:r>
+          </w:p>
+        </w:tc>
+        <w:tc>
+          <w:tcPr>
+            <w:tcW w:type="dxa" w:w="6192"/>
+          </w:tcPr>
+          <w:p>
+            <w:r>
+              <w:t>HTML5, CSS3 Glassmorphism, Dynamic Obsidian Black Canvas Fluid Physics Engine, Responsive Layout</w:t>
+            </w:r>
+          </w:p>
+        </w:tc>
+      </w:tr>
+      <w:tr>
+        <w:tc>
+          <w:tcPr>
+            <w:tcW w:type="dxa" w:w="3168"/>
+          </w:tcPr>
+          <w:p>
+            <w:r>
+              <w:t>Interactive Visual Console</w:t>
+            </w:r>
+          </w:p>
+        </w:tc>
+        <w:tc>
+          <w:tcPr>
+            <w:tcW w:type="dxa" w:w="6192"/>
+          </w:tcPr>
+          <w:p>
+            <w:r>
+              <w:t>Next.js, React, TypeScript, Tailwind CSS, Lucide Icons, NitroStack Widgets SDK</w:t>
+            </w:r>
+          </w:p>
+        </w:tc>
+      </w:tr>
+      <w:tr>
+        <w:tc>
+          <w:tcPr>
+            <w:tcW w:type="dxa" w:w="3168"/>
+          </w:tcPr>
+          <w:p>
+            <w:r>
+              <w:t>Backend &amp; MCP Orchestration</w:t>
+            </w:r>
+          </w:p>
+        </w:tc>
+        <w:tc>
+          <w:tcPr>
+            <w:tcW w:type="dxa" w:w="6192"/>
+          </w:tcPr>
+          <w:p>
+            <w:r>
+              <w:t>TypeScript, Node.js, NitroStack Core SDK (MCP Standard 2026-07-28, Dual Transport: Streamable HTTP, SSE, STDIO)</w:t>
+            </w:r>
+          </w:p>
+        </w:tc>
+      </w:tr>
+      <w:tr>
+        <w:tc>
+          <w:tcPr>
+            <w:tcW w:type="dxa" w:w="3168"/>
+          </w:tcPr>
+          <w:p>
+            <w:r>
+              <w:t>Machine Learning &amp; Analytics</w:t>
+            </w:r>
+          </w:p>
+        </w:tc>
+        <w:tc>
+          <w:tcPr>
+            <w:tcW w:type="dxa" w:w="6192"/>
+          </w:tcPr>
+          <w:p>
+            <w:r>
+              <w:t>Python 3.11, Scikit-Learn (Isolation Forest), XGBoost (Multi-Horizon Pre-Warming), Pandas, NumPy</w:t>
+            </w:r>
+          </w:p>
+        </w:tc>
+      </w:tr>
+      <w:tr>
+        <w:tc>
+          <w:tcPr>
+            <w:tcW w:type="dxa" w:w="3168"/>
+          </w:tcPr>
+          <w:p>
+            <w:r>
+              <w:t>Live Telemetry &amp; APIs</w:t>
+            </w:r>
+          </w:p>
+        </w:tc>
+        <w:tc>
+          <w:tcPr>
+            <w:tcW w:type="dxa" w:w="6192"/>
+          </w:tcPr>
+          <w:p>
+            <w:r>
+              <w:t>AWS Cost Explorer &amp; CloudWatch (SigV4 HMAC-SHA256), GCP Cloud Monitoring, Azure Retail Pricing REST API, UK National Grid Carbon API</w:t>
+            </w:r>
+          </w:p>
+        </w:tc>
+      </w:tr>
+      <w:tr>
+        <w:tc>
+          <w:tcPr>
+            <w:tcW w:type="dxa" w:w="3168"/>
+          </w:tcPr>
+          <w:p>
+            <w:r>
+              <w:t>Deployment</w:t>
+            </w:r>
+          </w:p>
+        </w:tc>
+        <w:tc>
+          <w:tcPr>
+            <w:tcW w:type="dxa" w:w="6192"/>
+          </w:tcPr>
+          <w:p>
+            <w:r>
+              <w:t>Docker (Multi-stage Debian Bookworm Container) and Render (Web Service Free Tier Continuous Deployment)</w:t>
+            </w:r>
+          </w:p>
+        </w:tc>
+      </w:tr>
+    </w:tbl>
+    <w:p>
+      <w:pPr>
+        <w:spacing w:after="0" w:before="0"/>
+      </w:pPr>
+    </w:p>
+    <w:p>
+      <w:pPr>
+        <w:pStyle w:val="Heading2"/>
+        <w:spacing w:before="160" w:after="80"/>
+      </w:pPr>
+      <w:r>
+        <w:t>4. How EcoFinOps AI Works</w:t>
       </w:r>
     </w:p>
     <w:p>
@@ -352,19 +557,14 @@
       </w:pPr>
       <w:r>
         <w:rPr>
-          <w:color w:val="10B981"/>
+          <w:b/>
         </w:rPr>
-        <w:t xml:space="preserve">▪  </w:t>
+        <w:t>1.</w:t>
+        <w:tab/>
+        <w:t>Ingest Data &amp; Live Telemetry.</w:t>
       </w:r>
       <w:r>
-        <w:rPr>
-          <w:b/>
-          <w:color w:val="0F172A"/>
-        </w:rPr>
-        <w:t xml:space="preserve">TypeScript / NitroStack MCP Core: </w:t>
-      </w:r>
-      <w:r>
-        <w:t>Orchestrates MCP session lifecycles, schema enforcement via Zod, tool dispatching, dual transport serving (HTTP, SSE, STDIO), and real-time WebSocket/HTTP streaming feeds.</w:t>
+        <w:t xml:space="preserve"> The system ingests multi-cloud billing records, real-time AWS CloudWatch telemetry via SigV4, GCP monitoring streams, live Azure retail spot prices, and electric grid carbon intensity factors over the internet.</w:t>
       </w:r>
     </w:p>
     <w:p>
@@ -374,19 +574,14 @@
       </w:pPr>
       <w:r>
         <w:rPr>
-          <w:color w:val="10B981"/>
+          <w:b/>
         </w:rPr>
-        <w:t xml:space="preserve">▪  </w:t>
+        <w:t>2.</w:t>
+        <w:tab/>
+        <w:t>Analyze Spend &amp; Detect Anomalies.</w:t>
       </w:r>
       <w:r>
-        <w:rPr>
-          <w:b/>
-          <w:color w:val="0F172A"/>
-        </w:rPr>
-        <w:t xml:space="preserve">Python Scientific ML Engine: </w:t>
-      </w:r>
-      <w:r>
-        <w:t>Executes high-dimensional statistical algorithms, including Isolation Forest anomaly detection, rolling-origin time-series regressors, and multi-horizon XGBoost pre-warming models.</w:t>
+        <w:t xml:space="preserve"> Agent 01 calculates cost breakdowns and budget pacing, while Agent 03 applies an unsupervised Isolation Forest model (contamination = 0.05) to isolate cost spikes and zombie idle compute nodes.</w:t>
       </w:r>
     </w:p>
     <w:p>
@@ -396,19 +591,14 @@
       </w:pPr>
       <w:r>
         <w:rPr>
-          <w:color w:val="10B981"/>
+          <w:b/>
         </w:rPr>
-        <w:t xml:space="preserve">▪  </w:t>
+        <w:t>3.</w:t>
+        <w:tab/>
+        <w:t>Forecast Future Costs.</w:t>
       </w:r>
       <w:r>
-        <w:rPr>
-          <w:b/>
-          <w:color w:val="0F172A"/>
-        </w:rPr>
-        <w:t xml:space="preserve">Dynamic Obsidian Black Interface: </w:t>
-      </w:r>
-      <w:r>
-        <w:t>Delivers an ultra-premium glassmorphic console (:root #000000 base, backdrop blur 20px) featuring a full-screen HTML5 white glass fluid simulation canvas reacting to mouse inertia, velocity droplets, and specular reflections at 60 FPS.</w:t>
+        <w:t xml:space="preserve"> Agent 02 trains a rolling-origin time-series ensemble (Ridge Regression + Random Forest) to project next-24h and next-30d cloud spend with 95% confidence intervals and validation metrics (MAE, RMSE, MAPE).</w:t>
       </w:r>
     </w:p>
     <w:p>
@@ -418,2249 +608,14 @@
       </w:pPr>
       <w:r>
         <w:rPr>
-          <w:color w:val="10B981"/>
+          <w:b/>
         </w:rPr>
-        <w:t xml:space="preserve">▪  </w:t>
+        <w:t>4.</w:t>
+        <w:tab/>
+        <w:t>Model Scope 2 Carbon &amp; Reschedule Jobs.</w:t>
       </w:r>
       <w:r>
-        <w:rPr>
-          <w:b/>
-          <w:color w:val="0F172A"/>
-        </w:rPr>
-        <w:t xml:space="preserve">Interactive Next.js Visual Widgets: </w:t>
-      </w:r>
-      <w:r>
-        <w:t>Three embedded visual consoles mounted at /dashboard (Executive Console), /resource-utilization (Safeguards Inspector), and /schedule-comparison (Trade-off Matrix).</w:t>
-      </w:r>
-    </w:p>
-    <w:p>
-      <w:pPr>
-        <w:keepNext/>
-        <w:spacing w:before="360" w:after="120"/>
-      </w:pPr>
-      <w:r>
-        <w:rPr>
-          <w:rFonts w:ascii="Calibri" w:hAnsi="Calibri"/>
-          <w:b/>
-          <w:color w:val="0F172A"/>
-          <w:sz w:val="32"/>
-        </w:rPr>
-        <w:t>3. The 12 Autonomous Specialist Agents</w:t>
-      </w:r>
-    </w:p>
-    <w:p>
-      <w:r>
-        <w:t>The core intelligence is distributed across 12 specialist agents coordinated by a central supervisor DAG:</w:t>
-      </w:r>
-    </w:p>
-    <w:tbl>
-      <w:tblPr>
-        <w:tblW w:type="auto" w:w="0"/>
-        <w:jc w:val="center"/>
-        <w:tblLayout w:type="fixed"/>
-        <w:tblLook w:firstColumn="1" w:firstRow="1" w:lastColumn="0" w:lastRow="0" w:noHBand="0" w:noVBand="1" w:val="04A0"/>
-      </w:tblPr>
-      <w:tblGrid>
-        <w:gridCol w:w="3120"/>
-        <w:gridCol w:w="3120"/>
-        <w:gridCol w:w="3120"/>
-      </w:tblGrid>
-      <w:tr>
-        <w:tc>
-          <w:tcPr>
-            <w:tcW w:type="dxa" w:w="2592"/>
-            <w:shd w:fill="0F172A"/>
-            <w:tcMar>
-              <w:top w:w="80" w:type="dxa"/>
-              <w:bottom w:w="80" w:type="dxa"/>
-              <w:left w:w="100" w:type="dxa"/>
-              <w:right w:w="100" w:type="dxa"/>
-            </w:tcMar>
-          </w:tcPr>
-          <w:p>
-            <w:r>
-              <w:rPr>
-                <w:b/>
-                <w:color w:val="FFFFFF"/>
-                <w:sz w:val="19"/>
-              </w:rPr>
-              <w:t>Agent Identifier</w:t>
-            </w:r>
-          </w:p>
-        </w:tc>
-        <w:tc>
-          <w:tcPr>
-            <w:tcW w:type="dxa" w:w="2448"/>
-            <w:shd w:fill="0F172A"/>
-            <w:tcMar>
-              <w:top w:w="80" w:type="dxa"/>
-              <w:bottom w:w="80" w:type="dxa"/>
-              <w:left w:w="100" w:type="dxa"/>
-              <w:right w:w="100" w:type="dxa"/>
-            </w:tcMar>
-          </w:tcPr>
-          <w:p>
-            <w:r>
-              <w:rPr>
-                <w:b/>
-                <w:color w:val="FFFFFF"/>
-                <w:sz w:val="19"/>
-              </w:rPr>
-              <w:t>Operational Domain</w:t>
-            </w:r>
-          </w:p>
-        </w:tc>
-        <w:tc>
-          <w:tcPr>
-            <w:tcW w:type="dxa" w:w="4320"/>
-            <w:shd w:fill="0F172A"/>
-            <w:tcMar>
-              <w:top w:w="80" w:type="dxa"/>
-              <w:bottom w:w="80" w:type="dxa"/>
-              <w:left w:w="100" w:type="dxa"/>
-              <w:right w:w="100" w:type="dxa"/>
-            </w:tcMar>
-          </w:tcPr>
-          <w:p>
-            <w:r>
-              <w:rPr>
-                <w:b/>
-                <w:color w:val="FFFFFF"/>
-                <w:sz w:val="19"/>
-              </w:rPr>
-              <w:t>Key Responsibilities &amp; Algorithm</w:t>
-            </w:r>
-          </w:p>
-        </w:tc>
-      </w:tr>
-      <w:tr>
-        <w:tc>
-          <w:tcPr>
-            <w:tcW w:type="dxa" w:w="2592"/>
-            <w:shd w:fill="F8FAFC"/>
-            <w:tcMar>
-              <w:top w:w="60" w:type="dxa"/>
-              <w:bottom w:w="60" w:type="dxa"/>
-              <w:left w:w="80" w:type="dxa"/>
-              <w:right w:w="80" w:type="dxa"/>
-            </w:tcMar>
-          </w:tcPr>
-          <w:p>
-            <w:pPr>
-              <w:spacing w:after="40"/>
-            </w:pPr>
-            <w:r>
-              <w:rPr>
-                <w:b/>
-                <w:color w:val="0F172A"/>
-                <w:sz w:val="18"/>
-              </w:rPr>
-              <w:t>Agent 01: FinOps Analyst</w:t>
-            </w:r>
-          </w:p>
-        </w:tc>
-        <w:tc>
-          <w:tcPr>
-            <w:tcW w:type="dxa" w:w="2448"/>
-            <w:shd w:fill="F8FAFC"/>
-            <w:tcMar>
-              <w:top w:w="60" w:type="dxa"/>
-              <w:bottom w:w="60" w:type="dxa"/>
-              <w:left w:w="80" w:type="dxa"/>
-              <w:right w:w="80" w:type="dxa"/>
-            </w:tcMar>
-          </w:tcPr>
-          <w:p>
-            <w:pPr>
-              <w:spacing w:after="40"/>
-            </w:pPr>
-            <w:r>
-              <w:rPr>
-                <w:color w:val="047857"/>
-                <w:sz w:val="18"/>
-              </w:rPr>
-              <w:t>Spend Breakdown &amp; Driver Ranking</w:t>
-            </w:r>
-          </w:p>
-        </w:tc>
-        <w:tc>
-          <w:tcPr>
-            <w:tcW w:type="dxa" w:w="4320"/>
-            <w:shd w:fill="F8FAFC"/>
-            <w:tcMar>
-              <w:top w:w="60" w:type="dxa"/>
-              <w:bottom w:w="60" w:type="dxa"/>
-              <w:left w:w="80" w:type="dxa"/>
-              <w:right w:w="80" w:type="dxa"/>
-            </w:tcMar>
-          </w:tcPr>
-          <w:p>
-            <w:pPr>
-              <w:spacing w:after="40"/>
-            </w:pPr>
-            <w:r>
-              <w:rPr>
-                <w:color w:val="475569"/>
-                <w:sz w:val="18"/>
-              </w:rPr>
-              <w:t>Decomposes multi-cloud costs by service, account, region; tracks budget burn pacing; ranks savings opportunities.</w:t>
-            </w:r>
-          </w:p>
-        </w:tc>
-      </w:tr>
-      <w:tr>
-        <w:tc>
-          <w:tcPr>
-            <w:tcW w:type="dxa" w:w="2592"/>
-            <w:shd w:fill="FFFFFF"/>
-            <w:tcMar>
-              <w:top w:w="60" w:type="dxa"/>
-              <w:bottom w:w="60" w:type="dxa"/>
-              <w:left w:w="80" w:type="dxa"/>
-              <w:right w:w="80" w:type="dxa"/>
-            </w:tcMar>
-          </w:tcPr>
-          <w:p>
-            <w:pPr>
-              <w:spacing w:after="40"/>
-            </w:pPr>
-            <w:r>
-              <w:rPr>
-                <w:b/>
-                <w:color w:val="0F172A"/>
-                <w:sz w:val="18"/>
-              </w:rPr>
-              <w:t>Agent 02: Cost Forecasting</w:t>
-            </w:r>
-          </w:p>
-        </w:tc>
-        <w:tc>
-          <w:tcPr>
-            <w:tcW w:type="dxa" w:w="2448"/>
-            <w:shd w:fill="FFFFFF"/>
-            <w:tcMar>
-              <w:top w:w="60" w:type="dxa"/>
-              <w:bottom w:w="60" w:type="dxa"/>
-              <w:left w:w="80" w:type="dxa"/>
-              <w:right w:w="80" w:type="dxa"/>
-            </w:tcMar>
-          </w:tcPr>
-          <w:p>
-            <w:pPr>
-              <w:spacing w:after="40"/>
-            </w:pPr>
-            <w:r>
-              <w:rPr>
-                <w:color w:val="047857"/>
-                <w:sz w:val="18"/>
-              </w:rPr>
-              <w:t>Statistical Time-Series Pacing</w:t>
-            </w:r>
-          </w:p>
-        </w:tc>
-        <w:tc>
-          <w:tcPr>
-            <w:tcW w:type="dxa" w:w="4320"/>
-            <w:shd w:fill="FFFFFF"/>
-            <w:tcMar>
-              <w:top w:w="60" w:type="dxa"/>
-              <w:bottom w:w="60" w:type="dxa"/>
-              <w:left w:w="80" w:type="dxa"/>
-              <w:right w:w="80" w:type="dxa"/>
-            </w:tcMar>
-          </w:tcPr>
-          <w:p>
-            <w:pPr>
-              <w:spacing w:after="40"/>
-            </w:pPr>
-            <w:r>
-              <w:rPr>
-                <w:color w:val="475569"/>
-                <w:sz w:val="18"/>
-              </w:rPr>
-              <w:t>Generates forward expenditure projections with 95% confidence intervals using Ridge Regression and Random Forest ensembles.</w:t>
-            </w:r>
-          </w:p>
-        </w:tc>
-      </w:tr>
-      <w:tr>
-        <w:tc>
-          <w:tcPr>
-            <w:tcW w:type="dxa" w:w="2592"/>
-            <w:shd w:fill="F8FAFC"/>
-            <w:tcMar>
-              <w:top w:w="60" w:type="dxa"/>
-              <w:bottom w:w="60" w:type="dxa"/>
-              <w:left w:w="80" w:type="dxa"/>
-              <w:right w:w="80" w:type="dxa"/>
-            </w:tcMar>
-          </w:tcPr>
-          <w:p>
-            <w:pPr>
-              <w:spacing w:after="40"/>
-            </w:pPr>
-            <w:r>
-              <w:rPr>
-                <w:b/>
-                <w:color w:val="0F172A"/>
-                <w:sz w:val="18"/>
-              </w:rPr>
-              <w:t>Agent 03: Anomaly Detection</w:t>
-            </w:r>
-          </w:p>
-        </w:tc>
-        <w:tc>
-          <w:tcPr>
-            <w:tcW w:type="dxa" w:w="2448"/>
-            <w:shd w:fill="F8FAFC"/>
-            <w:tcMar>
-              <w:top w:w="60" w:type="dxa"/>
-              <w:bottom w:w="60" w:type="dxa"/>
-              <w:left w:w="80" w:type="dxa"/>
-              <w:right w:w="80" w:type="dxa"/>
-            </w:tcMar>
-          </w:tcPr>
-          <w:p>
-            <w:pPr>
-              <w:spacing w:after="40"/>
-            </w:pPr>
-            <w:r>
-              <w:rPr>
-                <w:color w:val="047857"/>
-                <w:sz w:val="18"/>
-              </w:rPr>
-              <w:t>Outlier &amp; Zombie Discovery</w:t>
-            </w:r>
-          </w:p>
-        </w:tc>
-        <w:tc>
-          <w:tcPr>
-            <w:tcW w:type="dxa" w:w="4320"/>
-            <w:shd w:fill="F8FAFC"/>
-            <w:tcMar>
-              <w:top w:w="60" w:type="dxa"/>
-              <w:bottom w:w="60" w:type="dxa"/>
-              <w:left w:w="80" w:type="dxa"/>
-              <w:right w:w="80" w:type="dxa"/>
-            </w:tcMar>
-          </w:tcPr>
-          <w:p>
-            <w:pPr>
-              <w:spacing w:after="40"/>
-            </w:pPr>
-            <w:r>
-              <w:rPr>
-                <w:color w:val="475569"/>
-                <w:sz w:val="18"/>
-              </w:rPr>
-              <w:t>Identifies multivariate spend spikes and zombie idle compute nodes using Isolation Forest (contamination=0.05).</w:t>
-            </w:r>
-          </w:p>
-        </w:tc>
-      </w:tr>
-      <w:tr>
-        <w:tc>
-          <w:tcPr>
-            <w:tcW w:type="dxa" w:w="2592"/>
-            <w:shd w:fill="FFFFFF"/>
-            <w:tcMar>
-              <w:top w:w="60" w:type="dxa"/>
-              <w:bottom w:w="60" w:type="dxa"/>
-              <w:left w:w="80" w:type="dxa"/>
-              <w:right w:w="80" w:type="dxa"/>
-            </w:tcMar>
-          </w:tcPr>
-          <w:p>
-            <w:pPr>
-              <w:spacing w:after="40"/>
-            </w:pPr>
-            <w:r>
-              <w:rPr>
-                <w:b/>
-                <w:color w:val="0F172A"/>
-                <w:sz w:val="18"/>
-              </w:rPr>
-              <w:t>Agent 04: Carbon Intelligence</w:t>
-            </w:r>
-          </w:p>
-        </w:tc>
-        <w:tc>
-          <w:tcPr>
-            <w:tcW w:type="dxa" w:w="2448"/>
-            <w:shd w:fill="FFFFFF"/>
-            <w:tcMar>
-              <w:top w:w="60" w:type="dxa"/>
-              <w:bottom w:w="60" w:type="dxa"/>
-              <w:left w:w="80" w:type="dxa"/>
-              <w:right w:w="80" w:type="dxa"/>
-            </w:tcMar>
-          </w:tcPr>
-          <w:p>
-            <w:pPr>
-              <w:spacing w:after="40"/>
-            </w:pPr>
-            <w:r>
-              <w:rPr>
-                <w:color w:val="047857"/>
-                <w:sz w:val="18"/>
-              </w:rPr>
-              <w:t>Scope 2 GHG Emissions Modeling</w:t>
-            </w:r>
-          </w:p>
-        </w:tc>
-        <w:tc>
-          <w:tcPr>
-            <w:tcW w:type="dxa" w:w="4320"/>
-            <w:shd w:fill="FFFFFF"/>
-            <w:tcMar>
-              <w:top w:w="60" w:type="dxa"/>
-              <w:bottom w:w="60" w:type="dxa"/>
-              <w:left w:w="80" w:type="dxa"/>
-              <w:right w:w="80" w:type="dxa"/>
-            </w:tcMar>
-          </w:tcPr>
-          <w:p>
-            <w:pPr>
-              <w:spacing w:after="40"/>
-            </w:pPr>
-            <w:r>
-              <w:rPr>
-                <w:color w:val="475569"/>
-                <w:sz w:val="18"/>
-              </w:rPr>
-              <w:t>Estimates kilowatt-hours and kg CO2e based on vCPU thermal design power, regional PUE standards, and grid factors.</w:t>
-            </w:r>
-          </w:p>
-        </w:tc>
-      </w:tr>
-      <w:tr>
-        <w:tc>
-          <w:tcPr>
-            <w:tcW w:type="dxa" w:w="2592"/>
-            <w:shd w:fill="F8FAFC"/>
-            <w:tcMar>
-              <w:top w:w="60" w:type="dxa"/>
-              <w:bottom w:w="60" w:type="dxa"/>
-              <w:left w:w="80" w:type="dxa"/>
-              <w:right w:w="80" w:type="dxa"/>
-            </w:tcMar>
-          </w:tcPr>
-          <w:p>
-            <w:pPr>
-              <w:spacing w:after="40"/>
-            </w:pPr>
-            <w:r>
-              <w:rPr>
-                <w:b/>
-                <w:color w:val="0F172A"/>
-                <w:sz w:val="18"/>
-              </w:rPr>
-              <w:t>Agent 05: Workload Scheduling</w:t>
-            </w:r>
-          </w:p>
-        </w:tc>
-        <w:tc>
-          <w:tcPr>
-            <w:tcW w:type="dxa" w:w="2448"/>
-            <w:shd w:fill="F8FAFC"/>
-            <w:tcMar>
-              <w:top w:w="60" w:type="dxa"/>
-              <w:bottom w:w="60" w:type="dxa"/>
-              <w:left w:w="80" w:type="dxa"/>
-              <w:right w:w="80" w:type="dxa"/>
-            </w:tcMar>
-          </w:tcPr>
-          <w:p>
-            <w:pPr>
-              <w:spacing w:after="40"/>
-            </w:pPr>
-            <w:r>
-              <w:rPr>
-                <w:color w:val="047857"/>
-                <w:sz w:val="18"/>
-              </w:rPr>
-              <w:t>Carbon-Aware Batch Shifting</w:t>
-            </w:r>
-          </w:p>
-        </w:tc>
-        <w:tc>
-          <w:tcPr>
-            <w:tcW w:type="dxa" w:w="4320"/>
-            <w:shd w:fill="F8FAFC"/>
-            <w:tcMar>
-              <w:top w:w="60" w:type="dxa"/>
-              <w:bottom w:w="60" w:type="dxa"/>
-              <w:left w:w="80" w:type="dxa"/>
-              <w:right w:w="80" w:type="dxa"/>
-            </w:tcMar>
-          </w:tcPr>
-          <w:p>
-            <w:pPr>
-              <w:spacing w:after="40"/>
-            </w:pPr>
-            <w:r>
-              <w:rPr>
-                <w:color w:val="475569"/>
-                <w:sz w:val="18"/>
-              </w:rPr>
-              <w:t>Aligns non-preemptive batch workloads with regional grid clean energy peaks while meeting hard arrival deadlines.</w:t>
-            </w:r>
-          </w:p>
-        </w:tc>
-      </w:tr>
-      <w:tr>
-        <w:tc>
-          <w:tcPr>
-            <w:tcW w:type="dxa" w:w="2592"/>
-            <w:shd w:fill="FFFFFF"/>
-            <w:tcMar>
-              <w:top w:w="60" w:type="dxa"/>
-              <w:bottom w:w="60" w:type="dxa"/>
-              <w:left w:w="80" w:type="dxa"/>
-              <w:right w:w="80" w:type="dxa"/>
-            </w:tcMar>
-          </w:tcPr>
-          <w:p>
-            <w:pPr>
-              <w:spacing w:after="40"/>
-            </w:pPr>
-            <w:r>
-              <w:rPr>
-                <w:b/>
-                <w:color w:val="0F172A"/>
-                <w:sz w:val="18"/>
-              </w:rPr>
-              <w:t>Agent 06: Resource Optimizer</w:t>
-            </w:r>
-          </w:p>
-        </w:tc>
-        <w:tc>
-          <w:tcPr>
-            <w:tcW w:type="dxa" w:w="2448"/>
-            <w:shd w:fill="FFFFFF"/>
-            <w:tcMar>
-              <w:top w:w="60" w:type="dxa"/>
-              <w:bottom w:w="60" w:type="dxa"/>
-              <w:left w:w="80" w:type="dxa"/>
-              <w:right w:w="80" w:type="dxa"/>
-            </w:tcMar>
-          </w:tcPr>
-          <w:p>
-            <w:pPr>
-              <w:spacing w:after="40"/>
-            </w:pPr>
-            <w:r>
-              <w:rPr>
-                <w:color w:val="047857"/>
-                <w:sz w:val="18"/>
-              </w:rPr>
-              <w:t>Rightsizing &amp; Safety Margin</w:t>
-            </w:r>
-          </w:p>
-        </w:tc>
-        <w:tc>
-          <w:tcPr>
-            <w:tcW w:type="dxa" w:w="4320"/>
-            <w:shd w:fill="FFFFFF"/>
-            <w:tcMar>
-              <w:top w:w="60" w:type="dxa"/>
-              <w:bottom w:w="60" w:type="dxa"/>
-              <w:left w:w="80" w:type="dxa"/>
-              <w:right w:w="80" w:type="dxa"/>
-            </w:tcMar>
-          </w:tcPr>
-          <w:p>
-            <w:pPr>
-              <w:spacing w:after="40"/>
-            </w:pPr>
-            <w:r>
-              <w:rPr>
-                <w:color w:val="475569"/>
-                <w:sz w:val="18"/>
-              </w:rPr>
-              <w:t>Recommends compute rightsizing; strictly enforces mandatory p95 peak CPU &lt;= 65% headroom safeguards.</w:t>
-            </w:r>
-          </w:p>
-        </w:tc>
-      </w:tr>
-      <w:tr>
-        <w:tc>
-          <w:tcPr>
-            <w:tcW w:type="dxa" w:w="2592"/>
-            <w:shd w:fill="F8FAFC"/>
-            <w:tcMar>
-              <w:top w:w="60" w:type="dxa"/>
-              <w:bottom w:w="60" w:type="dxa"/>
-              <w:left w:w="80" w:type="dxa"/>
-              <w:right w:w="80" w:type="dxa"/>
-            </w:tcMar>
-          </w:tcPr>
-          <w:p>
-            <w:pPr>
-              <w:spacing w:after="40"/>
-            </w:pPr>
-            <w:r>
-              <w:rPr>
-                <w:b/>
-                <w:color w:val="0F172A"/>
-                <w:sz w:val="18"/>
-              </w:rPr>
-              <w:t>Agent 07: Region Intelligence</w:t>
-            </w:r>
-          </w:p>
-        </w:tc>
-        <w:tc>
-          <w:tcPr>
-            <w:tcW w:type="dxa" w:w="2448"/>
-            <w:shd w:fill="F8FAFC"/>
-            <w:tcMar>
-              <w:top w:w="60" w:type="dxa"/>
-              <w:bottom w:w="60" w:type="dxa"/>
-              <w:left w:w="80" w:type="dxa"/>
-              <w:right w:w="80" w:type="dxa"/>
-            </w:tcMar>
-          </w:tcPr>
-          <w:p>
-            <w:pPr>
-              <w:spacing w:after="40"/>
-            </w:pPr>
-            <w:r>
-              <w:rPr>
-                <w:color w:val="047857"/>
-                <w:sz w:val="18"/>
-              </w:rPr>
-              <w:t>Geo-Arbitrage &amp; Carbon Tiers</w:t>
-            </w:r>
-          </w:p>
-        </w:tc>
-        <w:tc>
-          <w:tcPr>
-            <w:tcW w:type="dxa" w:w="4320"/>
-            <w:shd w:fill="F8FAFC"/>
-            <w:tcMar>
-              <w:top w:w="60" w:type="dxa"/>
-              <w:bottom w:w="60" w:type="dxa"/>
-              <w:left w:w="80" w:type="dxa"/>
-              <w:right w:w="80" w:type="dxa"/>
-            </w:tcMar>
-          </w:tcPr>
-          <w:p>
-            <w:pPr>
-              <w:spacing w:after="40"/>
-            </w:pPr>
-            <w:r>
-              <w:rPr>
-                <w:color w:val="475569"/>
-                <w:sz w:val="18"/>
-              </w:rPr>
-              <w:t>Evaluates cloud regions across pricing tiers, marginal carbon intensity (e.g. us-west-2 hydro vs us-east-1), and latency.</w:t>
-            </w:r>
-          </w:p>
-        </w:tc>
-      </w:tr>
-      <w:tr>
-        <w:tc>
-          <w:tcPr>
-            <w:tcW w:type="dxa" w:w="2592"/>
-            <w:shd w:fill="FFFFFF"/>
-            <w:tcMar>
-              <w:top w:w="60" w:type="dxa"/>
-              <w:bottom w:w="60" w:type="dxa"/>
-              <w:left w:w="80" w:type="dxa"/>
-              <w:right w:w="80" w:type="dxa"/>
-            </w:tcMar>
-          </w:tcPr>
-          <w:p>
-            <w:pPr>
-              <w:spacing w:after="40"/>
-            </w:pPr>
-            <w:r>
-              <w:rPr>
-                <w:b/>
-                <w:color w:val="0F172A"/>
-                <w:sz w:val="18"/>
-              </w:rPr>
-              <w:t>Agent 08: Multi-Objective Optimizer</w:t>
-            </w:r>
-          </w:p>
-        </w:tc>
-        <w:tc>
-          <w:tcPr>
-            <w:tcW w:type="dxa" w:w="2448"/>
-            <w:shd w:fill="FFFFFF"/>
-            <w:tcMar>
-              <w:top w:w="60" w:type="dxa"/>
-              <w:bottom w:w="60" w:type="dxa"/>
-              <w:left w:w="80" w:type="dxa"/>
-              <w:right w:w="80" w:type="dxa"/>
-            </w:tcMar>
-          </w:tcPr>
-          <w:p>
-            <w:pPr>
-              <w:spacing w:after="40"/>
-            </w:pPr>
-            <w:r>
-              <w:rPr>
-                <w:color w:val="047857"/>
-                <w:sz w:val="18"/>
-              </w:rPr>
-              <w:t>Pareto Frontier Scalarization</w:t>
-            </w:r>
-          </w:p>
-        </w:tc>
-        <w:tc>
-          <w:tcPr>
-            <w:tcW w:type="dxa" w:w="4320"/>
-            <w:shd w:fill="FFFFFF"/>
-            <w:tcMar>
-              <w:top w:w="60" w:type="dxa"/>
-              <w:bottom w:w="60" w:type="dxa"/>
-              <w:left w:w="80" w:type="dxa"/>
-              <w:right w:w="80" w:type="dxa"/>
-            </w:tcMar>
-          </w:tcPr>
-          <w:p>
-            <w:pPr>
-              <w:spacing w:after="40"/>
-            </w:pPr>
-            <w:r>
-              <w:rPr>
-                <w:color w:val="475569"/>
-                <w:sz w:val="18"/>
-              </w:rPr>
-              <w:t>Resolves trade-offs across Cost, Carbon, and Latency objectives by calculating the non-dominated Pareto frontier.</w:t>
-            </w:r>
-          </w:p>
-        </w:tc>
-      </w:tr>
-      <w:tr>
-        <w:tc>
-          <w:tcPr>
-            <w:tcW w:type="dxa" w:w="2592"/>
-            <w:shd w:fill="F8FAFC"/>
-            <w:tcMar>
-              <w:top w:w="60" w:type="dxa"/>
-              <w:bottom w:w="60" w:type="dxa"/>
-              <w:left w:w="80" w:type="dxa"/>
-              <w:right w:w="80" w:type="dxa"/>
-            </w:tcMar>
-          </w:tcPr>
-          <w:p>
-            <w:pPr>
-              <w:spacing w:after="40"/>
-            </w:pPr>
-            <w:r>
-              <w:rPr>
-                <w:b/>
-                <w:color w:val="0F172A"/>
-                <w:sz w:val="18"/>
-              </w:rPr>
-              <w:t>Agent 09: Verification Agent</w:t>
-            </w:r>
-          </w:p>
-        </w:tc>
-        <w:tc>
-          <w:tcPr>
-            <w:tcW w:type="dxa" w:w="2448"/>
-            <w:shd w:fill="F8FAFC"/>
-            <w:tcMar>
-              <w:top w:w="60" w:type="dxa"/>
-              <w:bottom w:w="60" w:type="dxa"/>
-              <w:left w:w="80" w:type="dxa"/>
-              <w:right w:w="80" w:type="dxa"/>
-            </w:tcMar>
-          </w:tcPr>
-          <w:p>
-            <w:pPr>
-              <w:spacing w:after="40"/>
-            </w:pPr>
-            <w:r>
-              <w:rPr>
-                <w:color w:val="047857"/>
-                <w:sz w:val="18"/>
-              </w:rPr>
-              <w:t>Deterministic Arithmetic Proofs</w:t>
-            </w:r>
-          </w:p>
-        </w:tc>
-        <w:tc>
-          <w:tcPr>
-            <w:tcW w:type="dxa" w:w="4320"/>
-            <w:shd w:fill="F8FAFC"/>
-            <w:tcMar>
-              <w:top w:w="60" w:type="dxa"/>
-              <w:bottom w:w="60" w:type="dxa"/>
-              <w:left w:w="80" w:type="dxa"/>
-              <w:right w:w="80" w:type="dxa"/>
-            </w:tcMar>
-          </w:tcPr>
-          <w:p>
-            <w:pPr>
-              <w:spacing w:after="40"/>
-            </w:pPr>
-            <w:r>
-              <w:rPr>
-                <w:color w:val="475569"/>
-                <w:sz w:val="18"/>
-              </w:rPr>
-              <w:t>Audits mathematical consistency (Baseline - Proposed == Savings); rejects phantom or exaggerated cost claims.</w:t>
-            </w:r>
-          </w:p>
-        </w:tc>
-      </w:tr>
-      <w:tr>
-        <w:tc>
-          <w:tcPr>
-            <w:tcW w:type="dxa" w:w="2592"/>
-            <w:shd w:fill="FFFFFF"/>
-            <w:tcMar>
-              <w:top w:w="60" w:type="dxa"/>
-              <w:bottom w:w="60" w:type="dxa"/>
-              <w:left w:w="80" w:type="dxa"/>
-              <w:right w:w="80" w:type="dxa"/>
-            </w:tcMar>
-          </w:tcPr>
-          <w:p>
-            <w:pPr>
-              <w:spacing w:after="40"/>
-            </w:pPr>
-            <w:r>
-              <w:rPr>
-                <w:b/>
-                <w:color w:val="0F172A"/>
-                <w:sz w:val="18"/>
-              </w:rPr>
-              <w:t>Agent 10: Supervisor &amp; Orchestrator</w:t>
-            </w:r>
-          </w:p>
-        </w:tc>
-        <w:tc>
-          <w:tcPr>
-            <w:tcW w:type="dxa" w:w="2448"/>
-            <w:shd w:fill="FFFFFF"/>
-            <w:tcMar>
-              <w:top w:w="60" w:type="dxa"/>
-              <w:bottom w:w="60" w:type="dxa"/>
-              <w:left w:w="80" w:type="dxa"/>
-              <w:right w:w="80" w:type="dxa"/>
-            </w:tcMar>
-          </w:tcPr>
-          <w:p>
-            <w:pPr>
-              <w:spacing w:after="40"/>
-            </w:pPr>
-            <w:r>
-              <w:rPr>
-                <w:color w:val="047857"/>
-                <w:sz w:val="18"/>
-              </w:rPr>
-              <w:t>Intent Routing &amp; Execution DAG</w:t>
-            </w:r>
-          </w:p>
-        </w:tc>
-        <w:tc>
-          <w:tcPr>
-            <w:tcW w:type="dxa" w:w="4320"/>
-            <w:shd w:fill="FFFFFF"/>
-            <w:tcMar>
-              <w:top w:w="60" w:type="dxa"/>
-              <w:bottom w:w="60" w:type="dxa"/>
-              <w:left w:w="80" w:type="dxa"/>
-              <w:right w:w="80" w:type="dxa"/>
-            </w:tcMar>
-          </w:tcPr>
-          <w:p>
-            <w:pPr>
-              <w:spacing w:after="40"/>
-            </w:pPr>
-            <w:r>
-              <w:rPr>
-                <w:color w:val="475569"/>
-                <w:sz w:val="18"/>
-              </w:rPr>
-              <w:t>Classifies user intent, constructs cycle-free execution graphs, and manages multi-agent coordination traces.</w:t>
-            </w:r>
-          </w:p>
-        </w:tc>
-      </w:tr>
-      <w:tr>
-        <w:tc>
-          <w:tcPr>
-            <w:tcW w:type="dxa" w:w="2592"/>
-            <w:shd w:fill="F8FAFC"/>
-            <w:tcMar>
-              <w:top w:w="60" w:type="dxa"/>
-              <w:bottom w:w="60" w:type="dxa"/>
-              <w:left w:w="80" w:type="dxa"/>
-              <w:right w:w="80" w:type="dxa"/>
-            </w:tcMar>
-          </w:tcPr>
-          <w:p>
-            <w:pPr>
-              <w:spacing w:after="40"/>
-            </w:pPr>
-            <w:r>
-              <w:rPr>
-                <w:b/>
-                <w:color w:val="0F172A"/>
-                <w:sz w:val="18"/>
-              </w:rPr>
-              <w:t>Agent 11: Governance &amp; Risk</w:t>
-            </w:r>
-          </w:p>
-        </w:tc>
-        <w:tc>
-          <w:tcPr>
-            <w:tcW w:type="dxa" w:w="2448"/>
-            <w:shd w:fill="F8FAFC"/>
-            <w:tcMar>
-              <w:top w:w="60" w:type="dxa"/>
-              <w:bottom w:w="60" w:type="dxa"/>
-              <w:left w:w="80" w:type="dxa"/>
-              <w:right w:w="80" w:type="dxa"/>
-            </w:tcMar>
-          </w:tcPr>
-          <w:p>
-            <w:pPr>
-              <w:spacing w:after="40"/>
-            </w:pPr>
-            <w:r>
-              <w:rPr>
-                <w:color w:val="047857"/>
-                <w:sz w:val="18"/>
-              </w:rPr>
-              <w:t>Read-Only Policy Guardrails</w:t>
-            </w:r>
-          </w:p>
-        </w:tc>
-        <w:tc>
-          <w:tcPr>
-            <w:tcW w:type="dxa" w:w="4320"/>
-            <w:shd w:fill="F8FAFC"/>
-            <w:tcMar>
-              <w:top w:w="60" w:type="dxa"/>
-              <w:bottom w:w="60" w:type="dxa"/>
-              <w:left w:w="80" w:type="dxa"/>
-              <w:right w:w="80" w:type="dxa"/>
-            </w:tcMar>
-          </w:tcPr>
-          <w:p>
-            <w:pPr>
-              <w:spacing w:after="40"/>
-            </w:pPr>
-            <w:r>
-              <w:rPr>
-                <w:color w:val="475569"/>
-                <w:sz w:val="18"/>
-              </w:rPr>
-              <w:t>Enforces zero-mutation cloud rules; requires human approval for any destructive operations; scrubs secrets.</w:t>
-            </w:r>
-          </w:p>
-        </w:tc>
-      </w:tr>
-      <w:tr>
-        <w:tc>
-          <w:tcPr>
-            <w:tcW w:type="dxa" w:w="2592"/>
-            <w:shd w:fill="FFFFFF"/>
-            <w:tcMar>
-              <w:top w:w="60" w:type="dxa"/>
-              <w:bottom w:w="60" w:type="dxa"/>
-              <w:left w:w="80" w:type="dxa"/>
-              <w:right w:w="80" w:type="dxa"/>
-            </w:tcMar>
-          </w:tcPr>
-          <w:p>
-            <w:pPr>
-              <w:spacing w:after="40"/>
-            </w:pPr>
-            <w:r>
-              <w:rPr>
-                <w:b/>
-                <w:color w:val="0F172A"/>
-                <w:sz w:val="18"/>
-              </w:rPr>
-              <w:t>Agent 12: Reporting &amp; Explanation</w:t>
-            </w:r>
-          </w:p>
-        </w:tc>
-        <w:tc>
-          <w:tcPr>
-            <w:tcW w:type="dxa" w:w="2448"/>
-            <w:shd w:fill="FFFFFF"/>
-            <w:tcMar>
-              <w:top w:w="60" w:type="dxa"/>
-              <w:bottom w:w="60" w:type="dxa"/>
-              <w:left w:w="80" w:type="dxa"/>
-              <w:right w:w="80" w:type="dxa"/>
-            </w:tcMar>
-          </w:tcPr>
-          <w:p>
-            <w:pPr>
-              <w:spacing w:after="40"/>
-            </w:pPr>
-            <w:r>
-              <w:rPr>
-                <w:color w:val="047857"/>
-                <w:sz w:val="18"/>
-              </w:rPr>
-              <w:t>Executive Briefing Synthesis</w:t>
-            </w:r>
-          </w:p>
-        </w:tc>
-        <w:tc>
-          <w:tcPr>
-            <w:tcW w:type="dxa" w:w="4320"/>
-            <w:shd w:fill="FFFFFF"/>
-            <w:tcMar>
-              <w:top w:w="60" w:type="dxa"/>
-              <w:bottom w:w="60" w:type="dxa"/>
-              <w:left w:w="80" w:type="dxa"/>
-              <w:right w:w="80" w:type="dxa"/>
-            </w:tcMar>
-          </w:tcPr>
-          <w:p>
-            <w:pPr>
-              <w:spacing w:after="40"/>
-            </w:pPr>
-            <w:r>
-              <w:rPr>
-                <w:color w:val="475569"/>
-                <w:sz w:val="18"/>
-              </w:rPr>
-              <w:t>Compiles publication-grade markdown briefs detailing calculation provenance, caveats, and verified action plans.</w:t>
-            </w:r>
-          </w:p>
-        </w:tc>
-      </w:tr>
-    </w:tbl>
-    <w:p>
-      <w:pPr>
-        <w:spacing w:after="160"/>
-      </w:pPr>
-    </w:p>
-    <w:p>
-      <w:pPr>
-        <w:keepNext/>
-        <w:spacing w:before="360" w:after="120"/>
-      </w:pPr>
-      <w:r>
-        <w:rPr>
-          <w:rFonts w:ascii="Calibri" w:hAnsi="Calibri"/>
-          <w:b/>
-          <w:color w:val="0F172A"/>
-          <w:sz w:val="32"/>
-        </w:rPr>
-        <w:t>4. IEEE 2026 Research Engine: Predictive Serverless Pre-Warming</w:t>
-      </w:r>
-    </w:p>
-    <w:p>
-      <w:r>
-        <w:t>A foundational contribution of the EcoFinOps AI platform is the integration of IEEE 2026 Conference Research: 'Optimizing Serverless Cloud Computing using Agentic AI' by Kavitha P, Jithu S, and Devika A P.</w:t>
-      </w:r>
-    </w:p>
-    <w:p>
-      <w:r>
-        <w:t>Serverless functions suffer from severe cold-start initialization penalties (container scheduling, runtime provisioning, and connection pooling), causing invocation delays up to 2,500 ms and frequent SLA violations (&gt;100 ms threshold). EcoFinOps AI eliminates these penalties through an agentic closed-loop controller combining multi-horizon XGBoost prediction with dynamic resource tiering.</w:t>
-      </w:r>
-    </w:p>
-    <w:p>
-      <w:pPr>
-        <w:keepNext/>
-        <w:spacing w:before="240" w:after="80"/>
-      </w:pPr>
-      <w:r>
-        <w:rPr>
-          <w:rFonts w:ascii="Calibri" w:hAnsi="Calibri"/>
-          <w:b/>
-          <w:color w:val="059669"/>
-          <w:sz w:val="26"/>
-        </w:rPr>
-        <w:t>Calibration Trace: Microsoft Azure Functions 2019 Dataset</w:t>
-      </w:r>
-    </w:p>
-    <w:p>
-      <w:r>
-        <w:t>The predictive engine is empirically evaluated on the landmark Azure Functions 2019 dataset (Table I):</w:t>
-        <w:br/>
-        <w:t>• Duration: 14 consecutive days (20,160 minutes continuous recording)</w:t>
-        <w:br/>
-        <w:t>• Workload Analyzed: 72,359 distinct serverless functions</w:t>
-        <w:br/>
-        <w:t>• Total Evaluated Invocations: 12,495,810,950 requests</w:t>
-        <w:br/>
-        <w:t>• Peak Workload Volume: 1,258,768 invocations per minute</w:t>
-        <w:br/>
-        <w:t>• High-Velocity Burst Events Detected: 103 spike minutes</w:t>
-      </w:r>
-    </w:p>
-    <w:p>
-      <w:pPr>
-        <w:keepNext/>
-        <w:spacing w:before="240" w:after="80"/>
-      </w:pPr>
-      <w:r>
-        <w:rPr>
-          <w:rFonts w:ascii="Calibri" w:hAnsi="Calibri"/>
-          <w:b/>
-          <w:color w:val="059669"/>
-          <w:sz w:val="26"/>
-        </w:rPr>
-        <w:t>Multi-Horizon Lookahead XGBoost Accuracy (Table III)</w:t>
-      </w:r>
-    </w:p>
-    <w:p>
-      <w:r>
-        <w:t>The model forecasts arrival volumes across multiple forward-looking horizons to trigger proactive warming:</w:t>
-      </w:r>
-    </w:p>
-    <w:tbl>
-      <w:tblPr>
-        <w:tblW w:type="auto" w:w="0"/>
-        <w:jc w:val="center"/>
-        <w:tblLook w:firstColumn="1" w:firstRow="1" w:lastColumn="0" w:lastRow="0" w:noHBand="0" w:noVBand="1" w:val="04A0"/>
-      </w:tblPr>
-      <w:tblGrid>
-        <w:gridCol w:w="1872"/>
-        <w:gridCol w:w="1872"/>
-        <w:gridCol w:w="1872"/>
-        <w:gridCol w:w="1872"/>
-        <w:gridCol w:w="1872"/>
-      </w:tblGrid>
-      <w:tr>
-        <w:tc>
-          <w:tcPr>
-            <w:tcW w:type="dxa" w:w="1872"/>
-            <w:shd w:fill="0F172A"/>
-            <w:tcMar>
-              <w:top w:w="80" w:type="dxa"/>
-              <w:bottom w:w="80" w:type="dxa"/>
-              <w:left w:w="100" w:type="dxa"/>
-              <w:right w:w="100" w:type="dxa"/>
-            </w:tcMar>
-          </w:tcPr>
-          <w:p>
-            <w:r>
-              <w:rPr>
-                <w:b/>
-                <w:color w:val="FFFFFF"/>
-                <w:sz w:val="19"/>
-              </w:rPr>
-              <w:t>Lookahead Horizon</w:t>
-            </w:r>
-          </w:p>
-        </w:tc>
-        <w:tc>
-          <w:tcPr>
-            <w:tcW w:type="dxa" w:w="1872"/>
-            <w:shd w:fill="0F172A"/>
-            <w:tcMar>
-              <w:top w:w="80" w:type="dxa"/>
-              <w:bottom w:w="80" w:type="dxa"/>
-              <w:left w:w="100" w:type="dxa"/>
-              <w:right w:w="100" w:type="dxa"/>
-            </w:tcMar>
-          </w:tcPr>
-          <w:p>
-            <w:r>
-              <w:rPr>
-                <w:b/>
-                <w:color w:val="FFFFFF"/>
-                <w:sz w:val="19"/>
-              </w:rPr>
-              <w:t>Operational Window</w:t>
-            </w:r>
-          </w:p>
-        </w:tc>
-        <w:tc>
-          <w:tcPr>
-            <w:tcW w:type="dxa" w:w="1872"/>
-            <w:shd w:fill="0F172A"/>
-            <w:tcMar>
-              <w:top w:w="80" w:type="dxa"/>
-              <w:bottom w:w="80" w:type="dxa"/>
-              <w:left w:w="100" w:type="dxa"/>
-              <w:right w:w="100" w:type="dxa"/>
-            </w:tcMar>
-          </w:tcPr>
-          <w:p>
-            <w:r>
-              <w:rPr>
-                <w:b/>
-                <w:color w:val="FFFFFF"/>
-                <w:sz w:val="19"/>
-              </w:rPr>
-              <w:t>MAE</w:t>
-            </w:r>
-          </w:p>
-        </w:tc>
-        <w:tc>
-          <w:tcPr>
-            <w:tcW w:type="dxa" w:w="1872"/>
-            <w:shd w:fill="0F172A"/>
-            <w:tcMar>
-              <w:top w:w="80" w:type="dxa"/>
-              <w:bottom w:w="80" w:type="dxa"/>
-              <w:left w:w="100" w:type="dxa"/>
-              <w:right w:w="100" w:type="dxa"/>
-            </w:tcMar>
-          </w:tcPr>
-          <w:p>
-            <w:r>
-              <w:rPr>
-                <w:b/>
-                <w:color w:val="FFFFFF"/>
-                <w:sz w:val="19"/>
-              </w:rPr>
-              <w:t>RMSE</w:t>
-            </w:r>
-          </w:p>
-        </w:tc>
-        <w:tc>
-          <w:tcPr>
-            <w:tcW w:type="dxa" w:w="1872"/>
-            <w:shd w:fill="0F172A"/>
-            <w:tcMar>
-              <w:top w:w="80" w:type="dxa"/>
-              <w:bottom w:w="80" w:type="dxa"/>
-              <w:left w:w="100" w:type="dxa"/>
-              <w:right w:w="100" w:type="dxa"/>
-            </w:tcMar>
-          </w:tcPr>
-          <w:p>
-            <w:r>
-              <w:rPr>
-                <w:b/>
-                <w:color w:val="FFFFFF"/>
-                <w:sz w:val="19"/>
-              </w:rPr>
-              <w:t>R² Score</w:t>
-            </w:r>
-          </w:p>
-        </w:tc>
-      </w:tr>
-      <w:tr>
-        <w:tc>
-          <w:tcPr>
-            <w:tcW w:type="dxa" w:w="1872"/>
-            <w:shd w:fill="F8FAFC"/>
-            <w:tcMar>
-              <w:top w:w="60" w:type="dxa"/>
-              <w:bottom w:w="60" w:type="dxa"/>
-              <w:left w:w="80" w:type="dxa"/>
-              <w:right w:w="80" w:type="dxa"/>
-            </w:tcMar>
-          </w:tcPr>
-          <w:p>
-            <w:pPr>
-              <w:spacing w:after="40"/>
-            </w:pPr>
-            <w:r>
-              <w:rPr>
-                <w:b/>
-                <w:sz w:val="18"/>
-              </w:rPr>
-              <w:t>h = 1 min</w:t>
-            </w:r>
-          </w:p>
-        </w:tc>
-        <w:tc>
-          <w:tcPr>
-            <w:tcW w:type="dxa" w:w="1872"/>
-            <w:shd w:fill="F8FAFC"/>
-            <w:tcMar>
-              <w:top w:w="60" w:type="dxa"/>
-              <w:bottom w:w="60" w:type="dxa"/>
-              <w:left w:w="80" w:type="dxa"/>
-              <w:right w:w="80" w:type="dxa"/>
-            </w:tcMar>
-          </w:tcPr>
-          <w:p>
-            <w:pPr>
-              <w:spacing w:after="40"/>
-            </w:pPr>
-            <w:r>
-              <w:rPr>
-                <w:sz w:val="18"/>
-              </w:rPr>
-              <w:t>Immediate Lookahead</w:t>
-            </w:r>
-          </w:p>
-        </w:tc>
-        <w:tc>
-          <w:tcPr>
-            <w:tcW w:type="dxa" w:w="1872"/>
-            <w:shd w:fill="F8FAFC"/>
-            <w:tcMar>
-              <w:top w:w="60" w:type="dxa"/>
-              <w:bottom w:w="60" w:type="dxa"/>
-              <w:left w:w="80" w:type="dxa"/>
-              <w:right w:w="80" w:type="dxa"/>
-            </w:tcMar>
-          </w:tcPr>
-          <w:p>
-            <w:pPr>
-              <w:spacing w:after="40"/>
-            </w:pPr>
-            <w:r>
-              <w:rPr>
-                <w:sz w:val="18"/>
-              </w:rPr>
-              <w:t>14.28 req/min</w:t>
-            </w:r>
-          </w:p>
-        </w:tc>
-        <w:tc>
-          <w:tcPr>
-            <w:tcW w:type="dxa" w:w="1872"/>
-            <w:shd w:fill="F8FAFC"/>
-            <w:tcMar>
-              <w:top w:w="60" w:type="dxa"/>
-              <w:bottom w:w="60" w:type="dxa"/>
-              <w:left w:w="80" w:type="dxa"/>
-              <w:right w:w="80" w:type="dxa"/>
-            </w:tcMar>
-          </w:tcPr>
-          <w:p>
-            <w:pPr>
-              <w:spacing w:after="40"/>
-            </w:pPr>
-            <w:r>
-              <w:rPr>
-                <w:sz w:val="18"/>
-              </w:rPr>
-              <w:t>28.64 req/min</w:t>
-            </w:r>
-          </w:p>
-        </w:tc>
-        <w:tc>
-          <w:tcPr>
-            <w:tcW w:type="dxa" w:w="1872"/>
-            <w:shd w:fill="F8FAFC"/>
-            <w:tcMar>
-              <w:top w:w="60" w:type="dxa"/>
-              <w:bottom w:w="60" w:type="dxa"/>
-              <w:left w:w="80" w:type="dxa"/>
-              <w:right w:w="80" w:type="dxa"/>
-            </w:tcMar>
-          </w:tcPr>
-          <w:p>
-            <w:pPr>
-              <w:spacing w:after="40"/>
-            </w:pPr>
-            <w:r>
-              <w:rPr>
-                <w:sz w:val="18"/>
-              </w:rPr>
-              <w:t>0.9942</w:t>
-            </w:r>
-          </w:p>
-        </w:tc>
-      </w:tr>
-      <w:tr>
-        <w:tc>
-          <w:tcPr>
-            <w:tcW w:type="dxa" w:w="1872"/>
-            <w:shd w:fill="FFFFFF"/>
-            <w:tcMar>
-              <w:top w:w="60" w:type="dxa"/>
-              <w:bottom w:w="60" w:type="dxa"/>
-              <w:left w:w="80" w:type="dxa"/>
-              <w:right w:w="80" w:type="dxa"/>
-            </w:tcMar>
-          </w:tcPr>
-          <w:p>
-            <w:pPr>
-              <w:spacing w:after="40"/>
-            </w:pPr>
-            <w:r>
-              <w:rPr>
-                <w:b/>
-                <w:sz w:val="18"/>
-              </w:rPr>
-              <w:t>h = 3 min</w:t>
-            </w:r>
-          </w:p>
-        </w:tc>
-        <w:tc>
-          <w:tcPr>
-            <w:tcW w:type="dxa" w:w="1872"/>
-            <w:shd w:fill="FFFFFF"/>
-            <w:tcMar>
-              <w:top w:w="60" w:type="dxa"/>
-              <w:bottom w:w="60" w:type="dxa"/>
-              <w:left w:w="80" w:type="dxa"/>
-              <w:right w:w="80" w:type="dxa"/>
-            </w:tcMar>
-          </w:tcPr>
-          <w:p>
-            <w:pPr>
-              <w:spacing w:after="40"/>
-            </w:pPr>
-            <w:r>
-              <w:rPr>
-                <w:sz w:val="18"/>
-              </w:rPr>
-              <w:t>Container Pool Allocation</w:t>
-            </w:r>
-          </w:p>
-        </w:tc>
-        <w:tc>
-          <w:tcPr>
-            <w:tcW w:type="dxa" w:w="1872"/>
-            <w:shd w:fill="FFFFFF"/>
-            <w:tcMar>
-              <w:top w:w="60" w:type="dxa"/>
-              <w:bottom w:w="60" w:type="dxa"/>
-              <w:left w:w="80" w:type="dxa"/>
-              <w:right w:w="80" w:type="dxa"/>
-            </w:tcMar>
-          </w:tcPr>
-          <w:p>
-            <w:pPr>
-              <w:spacing w:after="40"/>
-            </w:pPr>
-            <w:r>
-              <w:rPr>
-                <w:sz w:val="18"/>
-              </w:rPr>
-              <w:t>32.15 req/min</w:t>
-            </w:r>
-          </w:p>
-        </w:tc>
-        <w:tc>
-          <w:tcPr>
-            <w:tcW w:type="dxa" w:w="1872"/>
-            <w:shd w:fill="FFFFFF"/>
-            <w:tcMar>
-              <w:top w:w="60" w:type="dxa"/>
-              <w:bottom w:w="60" w:type="dxa"/>
-              <w:left w:w="80" w:type="dxa"/>
-              <w:right w:w="80" w:type="dxa"/>
-            </w:tcMar>
-          </w:tcPr>
-          <w:p>
-            <w:pPr>
-              <w:spacing w:after="40"/>
-            </w:pPr>
-            <w:r>
-              <w:rPr>
-                <w:sz w:val="18"/>
-              </w:rPr>
-              <w:t>64.50 req/min</w:t>
-            </w:r>
-          </w:p>
-        </w:tc>
-        <w:tc>
-          <w:tcPr>
-            <w:tcW w:type="dxa" w:w="1872"/>
-            <w:shd w:fill="FFFFFF"/>
-            <w:tcMar>
-              <w:top w:w="60" w:type="dxa"/>
-              <w:bottom w:w="60" w:type="dxa"/>
-              <w:left w:w="80" w:type="dxa"/>
-              <w:right w:w="80" w:type="dxa"/>
-            </w:tcMar>
-          </w:tcPr>
-          <w:p>
-            <w:pPr>
-              <w:spacing w:after="40"/>
-            </w:pPr>
-            <w:r>
-              <w:rPr>
-                <w:sz w:val="18"/>
-              </w:rPr>
-              <w:t>0.9815</w:t>
-            </w:r>
-          </w:p>
-        </w:tc>
-      </w:tr>
-      <w:tr>
-        <w:tc>
-          <w:tcPr>
-            <w:tcW w:type="dxa" w:w="1872"/>
-            <w:shd w:fill="F8FAFC"/>
-            <w:tcMar>
-              <w:top w:w="60" w:type="dxa"/>
-              <w:bottom w:w="60" w:type="dxa"/>
-              <w:left w:w="80" w:type="dxa"/>
-              <w:right w:w="80" w:type="dxa"/>
-            </w:tcMar>
-          </w:tcPr>
-          <w:p>
-            <w:pPr>
-              <w:spacing w:after="40"/>
-            </w:pPr>
-            <w:r>
-              <w:rPr>
-                <w:b/>
-                <w:sz w:val="18"/>
-              </w:rPr>
-              <w:t>h = 5 min</w:t>
-            </w:r>
-          </w:p>
-        </w:tc>
-        <w:tc>
-          <w:tcPr>
-            <w:tcW w:type="dxa" w:w="1872"/>
-            <w:shd w:fill="F8FAFC"/>
-            <w:tcMar>
-              <w:top w:w="60" w:type="dxa"/>
-              <w:bottom w:w="60" w:type="dxa"/>
-              <w:left w:w="80" w:type="dxa"/>
-              <w:right w:w="80" w:type="dxa"/>
-            </w:tcMar>
-          </w:tcPr>
-          <w:p>
-            <w:pPr>
-              <w:spacing w:after="40"/>
-            </w:pPr>
-            <w:r>
-              <w:rPr>
-                <w:sz w:val="18"/>
-              </w:rPr>
-              <w:t>Cluster Elasticity Elastic Reserve</w:t>
-            </w:r>
-          </w:p>
-        </w:tc>
-        <w:tc>
-          <w:tcPr>
-            <w:tcW w:type="dxa" w:w="1872"/>
-            <w:shd w:fill="F8FAFC"/>
-            <w:tcMar>
-              <w:top w:w="60" w:type="dxa"/>
-              <w:bottom w:w="60" w:type="dxa"/>
-              <w:left w:w="80" w:type="dxa"/>
-              <w:right w:w="80" w:type="dxa"/>
-            </w:tcMar>
-          </w:tcPr>
-          <w:p>
-            <w:pPr>
-              <w:spacing w:after="40"/>
-            </w:pPr>
-            <w:r>
-              <w:rPr>
-                <w:sz w:val="18"/>
-              </w:rPr>
-              <w:t>58.90 req/min</w:t>
-            </w:r>
-          </w:p>
-        </w:tc>
-        <w:tc>
-          <w:tcPr>
-            <w:tcW w:type="dxa" w:w="1872"/>
-            <w:shd w:fill="F8FAFC"/>
-            <w:tcMar>
-              <w:top w:w="60" w:type="dxa"/>
-              <w:bottom w:w="60" w:type="dxa"/>
-              <w:left w:w="80" w:type="dxa"/>
-              <w:right w:w="80" w:type="dxa"/>
-            </w:tcMar>
-          </w:tcPr>
-          <w:p>
-            <w:pPr>
-              <w:spacing w:after="40"/>
-            </w:pPr>
-            <w:r>
-              <w:rPr>
-                <w:sz w:val="18"/>
-              </w:rPr>
-              <w:t>112.40 req/min</w:t>
-            </w:r>
-          </w:p>
-        </w:tc>
-        <w:tc>
-          <w:tcPr>
-            <w:tcW w:type="dxa" w:w="1872"/>
-            <w:shd w:fill="F8FAFC"/>
-            <w:tcMar>
-              <w:top w:w="60" w:type="dxa"/>
-              <w:bottom w:w="60" w:type="dxa"/>
-              <w:left w:w="80" w:type="dxa"/>
-              <w:right w:w="80" w:type="dxa"/>
-            </w:tcMar>
-          </w:tcPr>
-          <w:p>
-            <w:pPr>
-              <w:spacing w:after="40"/>
-            </w:pPr>
-            <w:r>
-              <w:rPr>
-                <w:sz w:val="18"/>
-              </w:rPr>
-              <w:t>0.9628</w:t>
-            </w:r>
-          </w:p>
-        </w:tc>
-      </w:tr>
-    </w:tbl>
-    <w:p>
-      <w:pPr>
-        <w:spacing w:after="160"/>
-      </w:pPr>
-    </w:p>
-    <w:p>
-      <w:pPr>
-        <w:keepNext/>
-        <w:spacing w:before="240" w:after="80"/>
-      </w:pPr>
-      <w:r>
-        <w:rPr>
-          <w:rFonts w:ascii="Calibri" w:hAnsi="Calibri"/>
-          <w:b/>
-          <w:color w:val="059669"/>
-          <w:sz w:val="26"/>
-        </w:rPr>
-        <w:t>Comparative System Performance (Table V)</w:t>
-      </w:r>
-    </w:p>
-    <w:p>
-      <w:r>
-        <w:t>Benchmarked against state-of-the-art baselines, the proposed agentic pre-warming framework achieves optimal latency and zero cold starts:</w:t>
-      </w:r>
-    </w:p>
-    <w:tbl>
-      <w:tblPr>
-        <w:tblW w:type="auto" w:w="0"/>
-        <w:jc w:val="center"/>
-        <w:tblLook w:firstColumn="1" w:firstRow="1" w:lastColumn="0" w:lastRow="0" w:noHBand="0" w:noVBand="1" w:val="04A0"/>
-      </w:tblPr>
-      <w:tblGrid>
-        <w:gridCol w:w="1872"/>
-        <w:gridCol w:w="1872"/>
-        <w:gridCol w:w="1872"/>
-        <w:gridCol w:w="1872"/>
-        <w:gridCol w:w="1872"/>
-      </w:tblGrid>
-      <w:tr>
-        <w:tc>
-          <w:tcPr>
-            <w:tcW w:type="dxa" w:w="1872"/>
-            <w:shd w:fill="0F172A"/>
-            <w:tcMar>
-              <w:top w:w="80" w:type="dxa"/>
-              <w:bottom w:w="80" w:type="dxa"/>
-              <w:left w:w="100" w:type="dxa"/>
-              <w:right w:w="100" w:type="dxa"/>
-            </w:tcMar>
-          </w:tcPr>
-          <w:p>
-            <w:r>
-              <w:rPr>
-                <w:b/>
-                <w:color w:val="FFFFFF"/>
-                <w:sz w:val="19"/>
-              </w:rPr>
-              <w:t>System Architecture</w:t>
-            </w:r>
-          </w:p>
-        </w:tc>
-        <w:tc>
-          <w:tcPr>
-            <w:tcW w:type="dxa" w:w="1872"/>
-            <w:shd w:fill="0F172A"/>
-            <w:tcMar>
-              <w:top w:w="80" w:type="dxa"/>
-              <w:bottom w:w="80" w:type="dxa"/>
-              <w:left w:w="100" w:type="dxa"/>
-              <w:right w:w="100" w:type="dxa"/>
-            </w:tcMar>
-          </w:tcPr>
-          <w:p>
-            <w:r>
-              <w:rPr>
-                <w:b/>
-                <w:color w:val="FFFFFF"/>
-                <w:sz w:val="19"/>
-              </w:rPr>
-              <w:t>Avg Latency (ms)</w:t>
-            </w:r>
-          </w:p>
-        </w:tc>
-        <w:tc>
-          <w:tcPr>
-            <w:tcW w:type="dxa" w:w="1872"/>
-            <w:shd w:fill="0F172A"/>
-            <w:tcMar>
-              <w:top w:w="80" w:type="dxa"/>
-              <w:bottom w:w="80" w:type="dxa"/>
-              <w:left w:w="100" w:type="dxa"/>
-              <w:right w:w="100" w:type="dxa"/>
-            </w:tcMar>
-          </w:tcPr>
-          <w:p>
-            <w:r>
-              <w:rPr>
-                <w:b/>
-                <w:color w:val="FFFFFF"/>
-                <w:sz w:val="19"/>
-              </w:rPr>
-              <w:t>Cold Starts Count</w:t>
-            </w:r>
-          </w:p>
-        </w:tc>
-        <w:tc>
-          <w:tcPr>
-            <w:tcW w:type="dxa" w:w="1872"/>
-            <w:shd w:fill="0F172A"/>
-            <w:tcMar>
-              <w:top w:w="80" w:type="dxa"/>
-              <w:bottom w:w="80" w:type="dxa"/>
-              <w:left w:w="100" w:type="dxa"/>
-              <w:right w:w="100" w:type="dxa"/>
-            </w:tcMar>
-          </w:tcPr>
-          <w:p>
-            <w:r>
-              <w:rPr>
-                <w:b/>
-                <w:color w:val="FFFFFF"/>
-                <w:sz w:val="19"/>
-              </w:rPr>
-              <w:t>Cold Start Rate</w:t>
-            </w:r>
-          </w:p>
-        </w:tc>
-        <w:tc>
-          <w:tcPr>
-            <w:tcW w:type="dxa" w:w="1872"/>
-            <w:shd w:fill="0F172A"/>
-            <w:tcMar>
-              <w:top w:w="80" w:type="dxa"/>
-              <w:bottom w:w="80" w:type="dxa"/>
-              <w:left w:w="100" w:type="dxa"/>
-              <w:right w:w="100" w:type="dxa"/>
-            </w:tcMar>
-          </w:tcPr>
-          <w:p>
-            <w:r>
-              <w:rPr>
-                <w:b/>
-                <w:color w:val="FFFFFF"/>
-                <w:sz w:val="19"/>
-              </w:rPr>
-              <w:t>Resource Util (%)</w:t>
-            </w:r>
-          </w:p>
-        </w:tc>
-      </w:tr>
-      <w:tr>
-        <w:tc>
-          <w:tcPr>
-            <w:tcW w:type="dxa" w:w="1872"/>
-            <w:shd w:fill="F8FAFC"/>
-            <w:tcMar>
-              <w:top w:w="60" w:type="dxa"/>
-              <w:bottom w:w="60" w:type="dxa"/>
-              <w:left w:w="80" w:type="dxa"/>
-              <w:right w:w="80" w:type="dxa"/>
-            </w:tcMar>
-          </w:tcPr>
-          <w:p>
-            <w:pPr>
-              <w:spacing w:after="40"/>
-            </w:pPr>
-            <w:r>
-              <w:rPr>
-                <w:sz w:val="18"/>
-              </w:rPr>
-              <w:t>Reactive Autoscaling</w:t>
-            </w:r>
-          </w:p>
-        </w:tc>
-        <w:tc>
-          <w:tcPr>
-            <w:tcW w:type="dxa" w:w="1872"/>
-            <w:shd w:fill="F8FAFC"/>
-            <w:tcMar>
-              <w:top w:w="60" w:type="dxa"/>
-              <w:bottom w:w="60" w:type="dxa"/>
-              <w:left w:w="80" w:type="dxa"/>
-              <w:right w:w="80" w:type="dxa"/>
-            </w:tcMar>
-          </w:tcPr>
-          <w:p>
-            <w:pPr>
-              <w:spacing w:after="40"/>
-            </w:pPr>
-            <w:r>
-              <w:rPr>
-                <w:sz w:val="18"/>
-              </w:rPr>
-              <w:t>65.09 ms (P99: 315.9ms)</w:t>
-            </w:r>
-          </w:p>
-        </w:tc>
-        <w:tc>
-          <w:tcPr>
-            <w:tcW w:type="dxa" w:w="1872"/>
-            <w:shd w:fill="F8FAFC"/>
-            <w:tcMar>
-              <w:top w:w="60" w:type="dxa"/>
-              <w:bottom w:w="60" w:type="dxa"/>
-              <w:left w:w="80" w:type="dxa"/>
-              <w:right w:w="80" w:type="dxa"/>
-            </w:tcMar>
-          </w:tcPr>
-          <w:p>
-            <w:pPr>
-              <w:spacing w:after="40"/>
-            </w:pPr>
-            <w:r>
-              <w:rPr>
-                <w:sz w:val="18"/>
-              </w:rPr>
-              <w:t>13,009,945</w:t>
-            </w:r>
-          </w:p>
-        </w:tc>
-        <w:tc>
-          <w:tcPr>
-            <w:tcW w:type="dxa" w:w="1872"/>
-            <w:shd w:fill="F8FAFC"/>
-            <w:tcMar>
-              <w:top w:w="60" w:type="dxa"/>
-              <w:bottom w:w="60" w:type="dxa"/>
-              <w:left w:w="80" w:type="dxa"/>
-              <w:right w:w="80" w:type="dxa"/>
-            </w:tcMar>
-          </w:tcPr>
-          <w:p>
-            <w:pPr>
-              <w:spacing w:after="40"/>
-            </w:pPr>
-            <w:r>
-              <w:rPr>
-                <w:sz w:val="18"/>
-              </w:rPr>
-              <w:t>0.6633%</w:t>
-            </w:r>
-          </w:p>
-        </w:tc>
-        <w:tc>
-          <w:tcPr>
-            <w:tcW w:type="dxa" w:w="1872"/>
-            <w:shd w:fill="F8FAFC"/>
-            <w:tcMar>
-              <w:top w:w="60" w:type="dxa"/>
-              <w:bottom w:w="60" w:type="dxa"/>
-              <w:left w:w="80" w:type="dxa"/>
-              <w:right w:w="80" w:type="dxa"/>
-            </w:tcMar>
-          </w:tcPr>
-          <w:p>
-            <w:pPr>
-              <w:spacing w:after="40"/>
-            </w:pPr>
-            <w:r>
-              <w:rPr>
-                <w:sz w:val="18"/>
-              </w:rPr>
-              <w:t>68.20%</w:t>
-            </w:r>
-          </w:p>
-        </w:tc>
-      </w:tr>
-      <w:tr>
-        <w:tc>
-          <w:tcPr>
-            <w:tcW w:type="dxa" w:w="1872"/>
-            <w:shd w:fill="FFFFFF"/>
-            <w:tcMar>
-              <w:top w:w="60" w:type="dxa"/>
-              <w:bottom w:w="60" w:type="dxa"/>
-              <w:left w:w="80" w:type="dxa"/>
-              <w:right w:w="80" w:type="dxa"/>
-            </w:tcMar>
-          </w:tcPr>
-          <w:p>
-            <w:pPr>
-              <w:spacing w:after="40"/>
-            </w:pPr>
-            <w:r>
-              <w:rPr>
-                <w:sz w:val="18"/>
-              </w:rPr>
-              <w:t>Single-Horizon Prediction (Lagging)</w:t>
-            </w:r>
-          </w:p>
-        </w:tc>
-        <w:tc>
-          <w:tcPr>
-            <w:tcW w:type="dxa" w:w="1872"/>
-            <w:shd w:fill="FFFFFF"/>
-            <w:tcMar>
-              <w:top w:w="60" w:type="dxa"/>
-              <w:bottom w:w="60" w:type="dxa"/>
-              <w:left w:w="80" w:type="dxa"/>
-              <w:right w:w="80" w:type="dxa"/>
-            </w:tcMar>
-          </w:tcPr>
-          <w:p>
-            <w:pPr>
-              <w:spacing w:after="40"/>
-            </w:pPr>
-            <w:r>
-              <w:rPr>
-                <w:sz w:val="18"/>
-              </w:rPr>
-              <w:t>73.09 ms (P99: 412.5ms)</w:t>
-            </w:r>
-          </w:p>
-        </w:tc>
-        <w:tc>
-          <w:tcPr>
-            <w:tcW w:type="dxa" w:w="1872"/>
-            <w:shd w:fill="FFFFFF"/>
-            <w:tcMar>
-              <w:top w:w="60" w:type="dxa"/>
-              <w:bottom w:w="60" w:type="dxa"/>
-              <w:left w:w="80" w:type="dxa"/>
-              <w:right w:w="80" w:type="dxa"/>
-            </w:tcMar>
-          </w:tcPr>
-          <w:p>
-            <w:pPr>
-              <w:spacing w:after="40"/>
-            </w:pPr>
-            <w:r>
-              <w:rPr>
-                <w:sz w:val="18"/>
-              </w:rPr>
-              <w:t>20,309,185</w:t>
-            </w:r>
-          </w:p>
-        </w:tc>
-        <w:tc>
-          <w:tcPr>
-            <w:tcW w:type="dxa" w:w="1872"/>
-            <w:shd w:fill="FFFFFF"/>
-            <w:tcMar>
-              <w:top w:w="60" w:type="dxa"/>
-              <w:bottom w:w="60" w:type="dxa"/>
-              <w:left w:w="80" w:type="dxa"/>
-              <w:right w:w="80" w:type="dxa"/>
-            </w:tcMar>
-          </w:tcPr>
-          <w:p>
-            <w:pPr>
-              <w:spacing w:after="40"/>
-            </w:pPr>
-            <w:r>
-              <w:rPr>
-                <w:sz w:val="18"/>
-              </w:rPr>
-              <w:t>1.0354%</w:t>
-            </w:r>
-          </w:p>
-        </w:tc>
-        <w:tc>
-          <w:tcPr>
-            <w:tcW w:type="dxa" w:w="1872"/>
-            <w:shd w:fill="FFFFFF"/>
-            <w:tcMar>
-              <w:top w:w="60" w:type="dxa"/>
-              <w:bottom w:w="60" w:type="dxa"/>
-              <w:left w:w="80" w:type="dxa"/>
-              <w:right w:w="80" w:type="dxa"/>
-            </w:tcMar>
-          </w:tcPr>
-          <w:p>
-            <w:pPr>
-              <w:spacing w:after="40"/>
-            </w:pPr>
-            <w:r>
-              <w:rPr>
-                <w:sz w:val="18"/>
-              </w:rPr>
-              <w:t>61.40%</w:t>
-            </w:r>
-          </w:p>
-        </w:tc>
-      </w:tr>
-      <w:tr>
-        <w:tc>
-          <w:tcPr>
-            <w:tcW w:type="dxa" w:w="1872"/>
-            <w:shd w:fill="F8FAFC"/>
-            <w:tcMar>
-              <w:top w:w="60" w:type="dxa"/>
-              <w:bottom w:w="60" w:type="dxa"/>
-              <w:left w:w="80" w:type="dxa"/>
-              <w:right w:w="80" w:type="dxa"/>
-            </w:tcMar>
-          </w:tcPr>
-          <w:p>
-            <w:pPr>
-              <w:spacing w:after="40"/>
-            </w:pPr>
-            <w:r>
-              <w:rPr>
-                <w:sz w:val="18"/>
-              </w:rPr>
-              <w:t>Prediction + Pre-Warming</w:t>
-            </w:r>
-          </w:p>
-        </w:tc>
-        <w:tc>
-          <w:tcPr>
-            <w:tcW w:type="dxa" w:w="1872"/>
-            <w:shd w:fill="F8FAFC"/>
-            <w:tcMar>
-              <w:top w:w="60" w:type="dxa"/>
-              <w:bottom w:w="60" w:type="dxa"/>
-              <w:left w:w="80" w:type="dxa"/>
-              <w:right w:w="80" w:type="dxa"/>
-            </w:tcMar>
-          </w:tcPr>
-          <w:p>
-            <w:pPr>
-              <w:spacing w:after="40"/>
-            </w:pPr>
-            <w:r>
-              <w:rPr>
-                <w:sz w:val="18"/>
-              </w:rPr>
-              <w:t>50.07 ms (P99: 52.1ms)</w:t>
-            </w:r>
-          </w:p>
-        </w:tc>
-        <w:tc>
-          <w:tcPr>
-            <w:tcW w:type="dxa" w:w="1872"/>
-            <w:shd w:fill="F8FAFC"/>
-            <w:tcMar>
-              <w:top w:w="60" w:type="dxa"/>
-              <w:bottom w:w="60" w:type="dxa"/>
-              <w:left w:w="80" w:type="dxa"/>
-              <w:right w:w="80" w:type="dxa"/>
-            </w:tcMar>
-          </w:tcPr>
-          <w:p>
-            <w:pPr>
-              <w:spacing w:after="40"/>
-            </w:pPr>
-            <w:r>
-              <w:rPr>
-                <w:sz w:val="18"/>
-              </w:rPr>
-              <w:t>74,017</w:t>
-            </w:r>
-          </w:p>
-        </w:tc>
-        <w:tc>
-          <w:tcPr>
-            <w:tcW w:type="dxa" w:w="1872"/>
-            <w:shd w:fill="F8FAFC"/>
-            <w:tcMar>
-              <w:top w:w="60" w:type="dxa"/>
-              <w:bottom w:w="60" w:type="dxa"/>
-              <w:left w:w="80" w:type="dxa"/>
-              <w:right w:w="80" w:type="dxa"/>
-            </w:tcMar>
-          </w:tcPr>
-          <w:p>
-            <w:pPr>
-              <w:spacing w:after="40"/>
-            </w:pPr>
-            <w:r>
-              <w:rPr>
-                <w:sz w:val="18"/>
-              </w:rPr>
-              <w:t>0.0038%</w:t>
-            </w:r>
-          </w:p>
-        </w:tc>
-        <w:tc>
-          <w:tcPr>
-            <w:tcW w:type="dxa" w:w="1872"/>
-            <w:shd w:fill="F8FAFC"/>
-            <w:tcMar>
-              <w:top w:w="60" w:type="dxa"/>
-              <w:bottom w:w="60" w:type="dxa"/>
-              <w:left w:w="80" w:type="dxa"/>
-              <w:right w:w="80" w:type="dxa"/>
-            </w:tcMar>
-          </w:tcPr>
-          <w:p>
-            <w:pPr>
-              <w:spacing w:after="40"/>
-            </w:pPr>
-            <w:r>
-              <w:rPr>
-                <w:sz w:val="18"/>
-              </w:rPr>
-              <w:t>72.10%</w:t>
-            </w:r>
-          </w:p>
-        </w:tc>
-      </w:tr>
-      <w:tr>
-        <w:tc>
-          <w:tcPr>
-            <w:tcW w:type="dxa" w:w="1872"/>
-            <w:shd w:fill="ECFDF5"/>
-            <w:tcMar>
-              <w:top w:w="60" w:type="dxa"/>
-              <w:bottom w:w="60" w:type="dxa"/>
-              <w:left w:w="80" w:type="dxa"/>
-              <w:right w:w="80" w:type="dxa"/>
-            </w:tcMar>
-          </w:tcPr>
-          <w:p>
-            <w:pPr>
-              <w:spacing w:after="40"/>
-            </w:pPr>
-            <w:r>
-              <w:rPr>
-                <w:b/>
-                <w:color w:val="047857"/>
-                <w:sz w:val="18"/>
-              </w:rPr>
-              <w:t>Proposed Agentic Multi-Horizon</w:t>
-            </w:r>
-          </w:p>
-        </w:tc>
-        <w:tc>
-          <w:tcPr>
-            <w:tcW w:type="dxa" w:w="1872"/>
-            <w:shd w:fill="ECFDF5"/>
-            <w:tcMar>
-              <w:top w:w="60" w:type="dxa"/>
-              <w:bottom w:w="60" w:type="dxa"/>
-              <w:left w:w="80" w:type="dxa"/>
-              <w:right w:w="80" w:type="dxa"/>
-            </w:tcMar>
-          </w:tcPr>
-          <w:p>
-            <w:pPr>
-              <w:spacing w:after="40"/>
-            </w:pPr>
-            <w:r>
-              <w:rPr>
-                <w:b/>
-                <w:color w:val="047857"/>
-                <w:sz w:val="18"/>
-              </w:rPr>
-              <w:t>50.00 ms (P99: 50.0ms)</w:t>
-            </w:r>
-          </w:p>
-        </w:tc>
-        <w:tc>
-          <w:tcPr>
-            <w:tcW w:type="dxa" w:w="1872"/>
-            <w:shd w:fill="ECFDF5"/>
-            <w:tcMar>
-              <w:top w:w="60" w:type="dxa"/>
-              <w:bottom w:w="60" w:type="dxa"/>
-              <w:left w:w="80" w:type="dxa"/>
-              <w:right w:w="80" w:type="dxa"/>
-            </w:tcMar>
-          </w:tcPr>
-          <w:p>
-            <w:pPr>
-              <w:spacing w:after="40"/>
-            </w:pPr>
-            <w:r>
-              <w:rPr>
-                <w:b/>
-                <w:color w:val="047857"/>
-                <w:sz w:val="18"/>
-              </w:rPr>
-              <w:t>0 (100% Avoided)</w:t>
-            </w:r>
-          </w:p>
-        </w:tc>
-        <w:tc>
-          <w:tcPr>
-            <w:tcW w:type="dxa" w:w="1872"/>
-            <w:shd w:fill="ECFDF5"/>
-            <w:tcMar>
-              <w:top w:w="60" w:type="dxa"/>
-              <w:bottom w:w="60" w:type="dxa"/>
-              <w:left w:w="80" w:type="dxa"/>
-              <w:right w:w="80" w:type="dxa"/>
-            </w:tcMar>
-          </w:tcPr>
-          <w:p>
-            <w:pPr>
-              <w:spacing w:after="40"/>
-            </w:pPr>
-            <w:r>
-              <w:rPr>
-                <w:b/>
-                <w:color w:val="047857"/>
-                <w:sz w:val="18"/>
-              </w:rPr>
-              <w:t>0.0000%</w:t>
-            </w:r>
-          </w:p>
-        </w:tc>
-        <w:tc>
-          <w:tcPr>
-            <w:tcW w:type="dxa" w:w="1872"/>
-            <w:shd w:fill="ECFDF5"/>
-            <w:tcMar>
-              <w:top w:w="60" w:type="dxa"/>
-              <w:bottom w:w="60" w:type="dxa"/>
-              <w:left w:w="80" w:type="dxa"/>
-              <w:right w:w="80" w:type="dxa"/>
-            </w:tcMar>
-          </w:tcPr>
-          <w:p>
-            <w:pPr>
-              <w:spacing w:after="40"/>
-            </w:pPr>
-            <w:r>
-              <w:rPr>
-                <w:b/>
-                <w:color w:val="047857"/>
-                <w:sz w:val="18"/>
-              </w:rPr>
-              <w:t>75.84%</w:t>
-            </w:r>
-          </w:p>
-        </w:tc>
-      </w:tr>
-    </w:tbl>
-    <w:p>
-      <w:pPr>
-        <w:spacing w:after="160"/>
-      </w:pPr>
-    </w:p>
-    <w:p>
-      <w:pPr>
-        <w:keepNext/>
-        <w:spacing w:before="360" w:after="120"/>
-      </w:pPr>
-      <w:r>
-        <w:rPr>
-          <w:rFonts w:ascii="Calibri" w:hAnsi="Calibri"/>
-          <w:b/>
-          <w:color w:val="0F172A"/>
-          <w:sz w:val="32"/>
-        </w:rPr>
-        <w:t>5. Model Context Protocol (MCP) Implementation</w:t>
-      </w:r>
-    </w:p>
-    <w:p>
-      <w:r>
-        <w:t>EcoFinOps AI adheres to the official Model Context Protocol (MCP specification 2026-07-28), enabling seamless native integration into enterprise AI environments including Claude Desktop, Cursor, and autonomous agent gateways.</w:t>
-      </w:r>
-    </w:p>
-    <w:p>
-      <w:pPr>
-        <w:keepNext/>
-        <w:spacing w:before="240" w:after="80"/>
-      </w:pPr>
-      <w:r>
-        <w:rPr>
-          <w:rFonts w:ascii="Calibri" w:hAnsi="Calibri"/>
-          <w:b/>
-          <w:color w:val="059669"/>
-          <w:sz w:val="26"/>
-        </w:rPr>
-        <w:t>Exposed MCP Tools</w:t>
+        <w:t xml:space="preserve"> Agent 04 models energy consumption (kWh) and greenhouse gas emissions (kg CO2e). Agent 05 evaluates candidate 24-hour dispatch windows to shift delay-tolerant batch jobs into clean energy periods while strictly satisfying arrival deadlines.</w:t>
       </w:r>
     </w:p>
     <w:p>
@@ -2670,19 +625,14 @@
       </w:pPr>
       <w:r>
         <w:rPr>
-          <w:color w:val="10B981"/>
+          <w:b/>
         </w:rPr>
-        <w:t xml:space="preserve">▪  </w:t>
+        <w:t>5.</w:t>
+        <w:tab/>
+        <w:t>Optimize Sizing with Safety Safeguards.</w:t>
       </w:r>
       <w:r>
-        <w:rPr>
-          <w:b/>
-          <w:color w:val="0F172A"/>
-        </w:rPr>
-        <w:t xml:space="preserve">analyze-resource-utilization: </w:t>
-      </w:r>
-      <w:r>
-        <w:t>Evaluates active compute instances across a configurable historical window (default 14 days), categorizing resources into normal, persistent-low, zombie_idle, and usage-spike. Enforces strict p95 CPU peak safeguards.</w:t>
+        <w:t xml:space="preserve"> Agent 06 evaluates rightsizing recommendations, strictly enforcing a mandatory peak p95 CPU &lt;= 65% safeguard rule to protect mission-critical workload bursts from degradation.</w:t>
       </w:r>
     </w:p>
     <w:p>
@@ -2692,63 +642,14 @@
       </w:pPr>
       <w:r>
         <w:rPr>
-          <w:color w:val="10B981"/>
+          <w:b/>
         </w:rPr>
-        <w:t xml:space="preserve">▪  </w:t>
+        <w:t>6.</w:t>
+        <w:tab/>
+        <w:t>Predictive Serverless Pre-Warming.</w:t>
       </w:r>
       <w:r>
-        <w:rPr>
-          <w:b/>
-          <w:color w:val="0F172A"/>
-        </w:rPr>
-        <w:t xml:space="preserve">compare-workload-schedules: </w:t>
-      </w:r>
-      <w:r>
-        <w:t>Compares 24-hour dispatch schedules for batch tasks, calculating cost in USD, emissions in kg CO2e, and grid intensity in gCO2/kWh across immediate, cost-optimized, carbon-optimized, and Pareto-optimal strategies.</w:t>
-      </w:r>
-    </w:p>
-    <w:p>
-      <w:pPr>
-        <w:keepNext/>
-        <w:spacing w:before="240" w:after="80"/>
-      </w:pPr>
-      <w:r>
-        <w:rPr>
-          <w:rFonts w:ascii="Calibri" w:hAnsi="Calibri"/>
-          <w:b/>
-          <w:color w:val="059669"/>
-          <w:sz w:val="26"/>
-        </w:rPr>
-        <w:t>Dual Transport Protocol Endpoints</w:t>
-      </w:r>
-    </w:p>
-    <w:p>
-      <w:r>
-        <w:t>• Streamable HTTP (/mcp): Stateless HTTP transport for cloud-native microservices.</w:t>
-        <w:br/>
-        <w:t>• Legacy SDK SSE (/sse): Server-Sent Events transport for interactive graphical UI bridges.</w:t>
-        <w:br/>
-        <w:t>• Direct STDIO: Standard I/O channel for secure local desktop client execution.</w:t>
-      </w:r>
-    </w:p>
-    <w:p>
-      <w:pPr>
-        <w:keepNext/>
-        <w:spacing w:before="360" w:after="120"/>
-      </w:pPr>
-      <w:r>
-        <w:rPr>
-          <w:rFonts w:ascii="Calibri" w:hAnsi="Calibri"/>
-          <w:b/>
-          <w:color w:val="0F172A"/>
-          <w:sz w:val="32"/>
-        </w:rPr>
-        <w:t>6. Live Cloud Telemetry &amp; Real-Time Internet Data Feeds</w:t>
-      </w:r>
-    </w:p>
-    <w:p>
-      <w:r>
-        <w:t>The system connects to real-world cloud APIs and open public telemetry sources over the internet:</w:t>
+        <w:t xml:space="preserve"> The serverless engine uses multi-horizon lookahead XGBoost models (h = 1, 3, 5 min) and dynamic 3-tier container pooling to pre-warm serverless containers, completely eliminating cold starts (0 cold starts, 100% avoided) and maintaining flat 50ms latency.</w:t>
       </w:r>
     </w:p>
     <w:p>
@@ -2758,19 +659,275 @@
       </w:pPr>
       <w:r>
         <w:rPr>
-          <w:color w:val="10B981"/>
+          <w:b/>
         </w:rPr>
-        <w:t xml:space="preserve">▪  </w:t>
+        <w:t>7.</w:t>
+        <w:tab/>
+        <w:t>Deterministic Verification &amp; Audit.</w:t>
       </w:r>
       <w:r>
-        <w:rPr>
-          <w:b/>
-          <w:color w:val="0F172A"/>
-        </w:rPr>
-        <w:t xml:space="preserve">AWS CloudWatch &amp; Cost Explorer: </w:t>
+        <w:t xml:space="preserve"> Agent 09 mathematically audits all recommendations (verifying that Baseline - Proposed == Verified Savings), rejecting any exaggerated claims. Agent 11 guarantees zero-mutation read-only safety guardrails, requiring explicit user approval for any destructive changes.</w:t>
       </w:r>
+    </w:p>
+    <w:p>
+      <w:pPr>
+        <w:pStyle w:val="Heading2"/>
+        <w:spacing w:before="160" w:after="80"/>
+      </w:pPr>
       <w:r>
-        <w:t>Integrates via native AWS Signature Version 4 (SigV4) HMAC-SHA256 authenticated REST requests, querying ce:GetCostAndUsage and CloudWatch CPU/Network metrics in read-only mode.</w:t>
+        <w:t>5. Main Files and Folders</w:t>
+      </w:r>
+    </w:p>
+    <w:tbl>
+      <w:tblPr>
+        <w:tblStyle w:val="TableGrid"/>
+        <w:tblW w:type="auto" w:w="0"/>
+        <w:jc w:val="center"/>
+        <w:tblLook w:firstColumn="1" w:firstRow="1" w:lastColumn="0" w:lastRow="0" w:noHBand="0" w:noVBand="1" w:val="04A0"/>
+      </w:tblPr>
+      <w:tblGrid>
+        <w:gridCol w:w="4680"/>
+        <w:gridCol w:w="4680"/>
+      </w:tblGrid>
+      <w:tr>
+        <w:tc>
+          <w:tcPr>
+            <w:tcW w:type="dxa" w:w="3168"/>
+          </w:tcPr>
+          <w:p>
+            <w:r>
+              <w:rPr>
+                <w:b/>
+              </w:rPr>
+              <w:t>File / Folder</w:t>
+            </w:r>
+          </w:p>
+        </w:tc>
+        <w:tc>
+          <w:tcPr>
+            <w:tcW w:type="dxa" w:w="6192"/>
+          </w:tcPr>
+          <w:p>
+            <w:r>
+              <w:rPr>
+                <w:b/>
+              </w:rPr>
+              <w:t>Purpose</w:t>
+            </w:r>
+          </w:p>
+        </w:tc>
+      </w:tr>
+      <w:tr>
+        <w:tc>
+          <w:tcPr>
+            <w:tcW w:type="dxa" w:w="3168"/>
+          </w:tcPr>
+          <w:p>
+            <w:r>
+              <w:t>src/index.ts</w:t>
+            </w:r>
+          </w:p>
+        </w:tc>
+        <w:tc>
+          <w:tcPr>
+            <w:tcW w:type="dxa" w:w="6192"/>
+          </w:tcPr>
+          <w:p>
+            <w:r>
+              <w:t>Main server entry point: boots NitroStack MCP dual transport, mounts web portal and REST endpoints.</w:t>
+            </w:r>
+          </w:p>
+        </w:tc>
+      </w:tr>
+      <w:tr>
+        <w:tc>
+          <w:tcPr>
+            <w:tcW w:type="dxa" w:w="3168"/>
+          </w:tcPr>
+          <w:p>
+            <w:r>
+              <w:t>src/portal/portal-template.ts</w:t>
+            </w:r>
+          </w:p>
+        </w:tc>
+        <w:tc>
+          <w:tcPr>
+            <w:tcW w:type="dxa" w:w="6192"/>
+          </w:tcPr>
+          <w:p>
+            <w:r>
+              <w:t>Interactive glassmorphic web dashboard, real-time telemetry stream engine, and dynamic canvas fluid physics.</w:t>
+            </w:r>
+          </w:p>
+        </w:tc>
+      </w:tr>
+      <w:tr>
+        <w:tc>
+          <w:tcPr>
+            <w:tcW w:type="dxa" w:w="3168"/>
+          </w:tcPr>
+          <w:p>
+            <w:r>
+              <w:t>src/modules/agents/</w:t>
+            </w:r>
+          </w:p>
+        </w:tc>
+        <w:tc>
+          <w:tcPr>
+            <w:tcW w:type="dxa" w:w="6192"/>
+          </w:tcPr>
+          <w:p>
+            <w:r>
+              <w:t>12 autonomous specialist agents (FinOps, Forecasting, Anomaly, Carbon, Scheduling, Rightsizing, Verification, etc.).</w:t>
+            </w:r>
+          </w:p>
+        </w:tc>
+      </w:tr>
+      <w:tr>
+        <w:tc>
+          <w:tcPr>
+            <w:tcW w:type="dxa" w:w="3168"/>
+          </w:tcPr>
+          <w:p>
+            <w:r>
+              <w:t>src/modules/cloud/cloud-telemetry.service.ts</w:t>
+            </w:r>
+          </w:p>
+        </w:tc>
+        <w:tc>
+          <w:tcPr>
+            <w:tcW w:type="dxa" w:w="6192"/>
+          </w:tcPr>
+          <w:p>
+            <w:r>
+              <w:t>Live cloud provider telemetry service (AWS SigV4, GCP, Azure Retail Pricing, National Grid Carbon API).</w:t>
+            </w:r>
+          </w:p>
+        </w:tc>
+      </w:tr>
+      <w:tr>
+        <w:tc>
+          <w:tcPr>
+            <w:tcW w:type="dxa" w:w="3168"/>
+          </w:tcPr>
+          <w:p>
+            <w:r>
+              <w:t>src/python/src/serverless_prewarming.py</w:t>
+            </w:r>
+          </w:p>
+        </w:tc>
+        <w:tc>
+          <w:tcPr>
+            <w:tcW w:type="dxa" w:w="6192"/>
+          </w:tcPr>
+          <w:p>
+            <w:r>
+              <w:t>IEEE 2026 serverless pre-warming engine calibrated on the Azure Functions 2019 dataset.</w:t>
+            </w:r>
+          </w:p>
+        </w:tc>
+      </w:tr>
+      <w:tr>
+        <w:tc>
+          <w:tcPr>
+            <w:tcW w:type="dxa" w:w="3168"/>
+          </w:tcPr>
+          <w:p>
+            <w:r>
+              <w:t>src/widgets/</w:t>
+            </w:r>
+          </w:p>
+        </w:tc>
+        <w:tc>
+          <w:tcPr>
+            <w:tcW w:type="dxa" w:w="6192"/>
+          </w:tcPr>
+          <w:p>
+            <w:r>
+              <w:t>Next.js interactive visualizer widgets (/dashboard, /resource-utilization, /schedule-comparison).</w:t>
+            </w:r>
+          </w:p>
+        </w:tc>
+      </w:tr>
+      <w:tr>
+        <w:tc>
+          <w:tcPr>
+            <w:tcW w:type="dxa" w:w="3168"/>
+          </w:tcPr>
+          <w:p>
+            <w:r>
+              <w:t>Dockerfile</w:t>
+            </w:r>
+          </w:p>
+        </w:tc>
+        <w:tc>
+          <w:tcPr>
+            <w:tcW w:type="dxa" w:w="6192"/>
+          </w:tcPr>
+          <w:p>
+            <w:r>
+              <w:t>Multi-stage container definition compiling TypeScript and setting up Python 3.11 virtual environment.</w:t>
+            </w:r>
+          </w:p>
+        </w:tc>
+      </w:tr>
+      <w:tr>
+        <w:tc>
+          <w:tcPr>
+            <w:tcW w:type="dxa" w:w="3168"/>
+          </w:tcPr>
+          <w:p>
+            <w:r>
+              <w:t>render.yaml</w:t>
+            </w:r>
+          </w:p>
+        </w:tc>
+        <w:tc>
+          <w:tcPr>
+            <w:tcW w:type="dxa" w:w="6192"/>
+          </w:tcPr>
+          <w:p>
+            <w:r>
+              <w:t>Infrastructure as code specification for automated continuous deployment on Render.</w:t>
+            </w:r>
+          </w:p>
+        </w:tc>
+      </w:tr>
+      <w:tr>
+        <w:tc>
+          <w:tcPr>
+            <w:tcW w:type="dxa" w:w="3168"/>
+          </w:tcPr>
+          <w:p>
+            <w:r>
+              <w:t>package.json</w:t>
+            </w:r>
+          </w:p>
+        </w:tc>
+        <w:tc>
+          <w:tcPr>
+            <w:tcW w:type="dxa" w:w="6192"/>
+          </w:tcPr>
+          <w:p>
+            <w:r>
+              <w:t>Node.js dependencies, CLI build targets, and test execution scripts.</w:t>
+            </w:r>
+          </w:p>
+        </w:tc>
+      </w:tr>
+    </w:tbl>
+    <w:p>
+      <w:pPr>
+        <w:spacing w:after="0" w:before="0"/>
+      </w:pPr>
+    </w:p>
+    <w:p>
+      <w:pPr>
+        <w:pStyle w:val="Heading2"/>
+        <w:spacing w:before="160" w:after="80"/>
+      </w:pPr>
+      <w:r>
+        <w:t>6. How to Use the Website</w:t>
       </w:r>
     </w:p>
     <w:p>
@@ -2780,19 +937,14 @@
       </w:pPr>
       <w:r>
         <w:rPr>
-          <w:color w:val="10B981"/>
+          <w:b/>
         </w:rPr>
-        <w:t xml:space="preserve">▪  </w:t>
+        <w:t>1.</w:t>
+        <w:tab/>
+        <w:t>Open the website.</w:t>
       </w:r>
       <w:r>
-        <w:rPr>
-          <w:b/>
-          <w:color w:val="0F172A"/>
-        </w:rPr>
-        <w:t xml:space="preserve">Google Cloud Platform (GCP): </w:t>
-      </w:r>
-      <w:r>
-        <w:t>Connects to monitoring.googleapis.com for Compute Engine time series and BigQuery billing exports.</w:t>
+        <w:t xml:space="preserve"> Go to the deployed EcoFinOps AI web application on Render: https://ecofinops-ai.onrender.com/</w:t>
       </w:r>
     </w:p>
     <w:p>
@@ -2802,19 +954,14 @@
       </w:pPr>
       <w:r>
         <w:rPr>
-          <w:color w:val="10B981"/>
+          <w:b/>
         </w:rPr>
-        <w:t xml:space="preserve">▪  </w:t>
+        <w:t>2.</w:t>
+        <w:tab/>
+        <w:t>Live 5-Second Telemetry Feed.</w:t>
       </w:r>
       <w:r>
-        <w:rPr>
-          <w:b/>
-          <w:color w:val="0F172A"/>
-        </w:rPr>
-        <w:t xml:space="preserve">Azure Retail Prices REST API: </w:t>
-      </w:r>
-      <w:r>
-        <w:t>Queries https://prices.azure.com/api/retail/prices in real-time to obtain public spot and on-demand VM retail rates without requiring authentication.</w:t>
+        <w:t xml:space="preserve"> Observe the live rolling compute usage line chart and active cloud resources inventory streaming real-time metrics every 5 seconds.</w:t>
       </w:r>
     </w:p>
     <w:p>
@@ -2824,110 +971,161 @@
       </w:pPr>
       <w:r>
         <w:rPr>
-          <w:color w:val="10B981"/>
+          <w:b/>
         </w:rPr>
-        <w:t xml:space="preserve">▪  </w:t>
+        <w:t>3.</w:t>
+        <w:tab/>
+        <w:t>Run Multi-Agent Scenarios.</w:t>
       </w:r>
       <w:r>
-        <w:rPr>
-          <w:b/>
-          <w:color w:val="0F172A"/>
-        </w:rPr>
-        <w:t xml:space="preserve">UK National Grid Carbon Intensity API: </w:t>
-      </w:r>
-      <w:r>
-        <w:t>Pulls live marginal regional carbon intensity factors (gCO2/kWh) and forecasts from https://api.carbonintensity.org.uk/intensity.</w:t>
+        <w:t xml:space="preserve"> Click on pre-configured optimizer scenarios (Cross-Domain FinOps, Anomaly Detection, Carbon Shifting, 30-Day Forecast) or enter custom natural language queries.</w:t>
       </w:r>
     </w:p>
     <w:p>
       <w:pPr>
-        <w:keepNext/>
-        <w:spacing w:before="360" w:after="120"/>
+        <w:spacing w:after="60"/>
+        <w:ind w:left="360"/>
       </w:pPr>
       <w:r>
         <w:rPr>
-          <w:rFonts w:ascii="Calibri" w:hAnsi="Calibri"/>
           <w:b/>
-          <w:color w:val="0F172A"/>
-          <w:sz w:val="32"/>
         </w:rPr>
-        <w:t>7. Deployment, Security &amp; Test Suite Verification</w:t>
+        <w:t>4.</w:t>
+        <w:tab/>
+        <w:t>Serverless Pre-Warming Simulator.</w:t>
+      </w:r>
+      <w:r>
+        <w:t xml:space="preserve"> Use the interactive Serverless Surge Calculator to compare reactive autoscaling vs. agentic lookahead pre-warming across customizable traffic surges.</w:t>
+      </w:r>
+    </w:p>
+    <w:p>
+      <w:pPr>
+        <w:spacing w:after="60"/>
+        <w:ind w:left="360"/>
+      </w:pPr>
+      <w:r>
+        <w:rPr>
+          <w:b/>
+        </w:rPr>
+        <w:t>5.</w:t>
+        <w:tab/>
+        <w:t>Query Live Internet Data.</w:t>
+      </w:r>
+      <w:r>
+        <w:t xml:space="preserve"> Click 'Query Live Data Over Internet' to pull real-time VM spot rates from Azure Retail API and national grid carbon emissions factors.</w:t>
+      </w:r>
+    </w:p>
+    <w:p>
+      <w:pPr>
+        <w:spacing w:after="60"/>
+        <w:ind w:left="360"/>
+      </w:pPr>
+      <w:r>
+        <w:rPr>
+          <w:b/>
+        </w:rPr>
+        <w:t>6.</w:t>
+        <w:tab/>
+        <w:t>Connect via Model Context Protocol (MCP).</w:t>
+      </w:r>
+      <w:r>
+        <w:t xml:space="preserve"> Copy the one-click MCP JSON configuration to connect Claude Desktop, Cursor, or AI sidecars to the live endpoint.</w:t>
+      </w:r>
+    </w:p>
+    <w:p>
+      <w:pPr>
+        <w:pStyle w:val="Heading2"/>
+        <w:spacing w:before="160" w:after="80"/>
+      </w:pPr>
+      <w:r>
+        <w:t>7. Quick Test</w:t>
       </w:r>
     </w:p>
     <w:p>
       <w:r>
-        <w:t>EcoFinOps AI is built for continuous delivery and zero-downtime free deployment on modern container platforms (Render, Koyeb, Railway).</w:t>
+        <w:t>Test the application locally or on cloud using the automated test suite:</w:t>
+        <w:br/>
+        <w:t>• TypeScript Unit Test Suite: Run 'npm run test:unit' to verify all 51 automated agent unit tests (51 passed, 0 failed).</w:t>
+        <w:br/>
+        <w:t>• Integration Test Suite: Run 'npm run test:integration' to validate end-to-end multi-agent workflow execution.</w:t>
+        <w:br/>
+        <w:t>• Python Scientific ML Pipeline: Run 'npm run test:python' to evaluate Isolation Forest, time-series forecasting, and XGBoost lookahead accuracy.</w:t>
+        <w:br/>
+        <w:t>• REST API Endpoints: Query '/api/cloud/live-stream' and '/api/cloud/telemetry' to verify live JSON data responses.</w:t>
       </w:r>
     </w:p>
     <w:p>
       <w:pPr>
-        <w:keepNext/>
-        <w:spacing w:before="240" w:after="80"/>
+        <w:spacing w:after="0" w:before="0"/>
+      </w:pPr>
+    </w:p>
+    <w:p>
+      <w:pPr>
+        <w:spacing w:before="200" w:after="80"/>
       </w:pPr>
       <w:r>
         <w:rPr>
-          <w:rFonts w:ascii="Calibri" w:hAnsi="Calibri"/>
           <w:b/>
-          <w:color w:val="059669"/>
-          <w:sz w:val="26"/>
+          <w:sz w:val="22"/>
         </w:rPr>
-        <w:t>Container Configuration (Dockerfile &amp; render.yaml)</w:t>
+        <w:t>Deployed Project Links</w:t>
+      </w:r>
+    </w:p>
+    <w:p>
+      <w:pPr>
+        <w:spacing w:after="40"/>
+      </w:pPr>
+      <w:r>
+        <w:rPr>
+          <w:b/>
+        </w:rPr>
+        <w:t>EcoFinOps AI</w:t>
+      </w:r>
+    </w:p>
+    <w:p>
+      <w:pPr>
+        <w:spacing w:after="20"/>
+      </w:pPr>
+      <w:r>
+        <w:t>Frontend / Web Portal: https://ecofinops-ai.onrender.com/</w:t>
+      </w:r>
+    </w:p>
+    <w:p>
+      <w:pPr>
+        <w:spacing w:after="20"/>
+      </w:pPr>
+      <w:r>
+        <w:t>Backend / MCP Endpoint: https://ecofinops-ai.onrender.com/mcp</w:t>
+      </w:r>
+    </w:p>
+    <w:p>
+      <w:pPr>
+        <w:spacing w:after="160"/>
+      </w:pPr>
+      <w:r>
+        <w:t>GitHub Repository: https://github.com/jithusunil30/cloud-computing-project</w:t>
+      </w:r>
+    </w:p>
+    <w:p>
+      <w:pPr>
+        <w:spacing w:before="200" w:after="80"/>
+      </w:pPr>
+      <w:r>
+        <w:rPr>
+          <w:b/>
+          <w:sz w:val="22"/>
+        </w:rPr>
+        <w:t>Conclusion</w:t>
       </w:r>
     </w:p>
     <w:p>
       <w:r>
-        <w:t>The application packages as a multi-stage Debian Bookworm container containing Node.js 20 and a dedicated Python 3.11 virtual environment. The Render Blueprint (render.yaml) automatically provisions the web service, mounts health checks at /mcp/health, and syncs cloud credentials (AWS_ACCESS_KEY_ID, AWS_SECRET_ACCESS_KEY, GCP_PROJECT_ID, OPENAI_API_KEY) in secure environment variables.</w:t>
-      </w:r>
-    </w:p>
-    <w:p>
-      <w:pPr>
-        <w:keepNext/>
-        <w:spacing w:before="240" w:after="80"/>
-      </w:pPr>
-      <w:r>
-        <w:rPr>
-          <w:rFonts w:ascii="Calibri" w:hAnsi="Calibri"/>
-          <w:b/>
-          <w:color w:val="059669"/>
-          <w:sz w:val="26"/>
-        </w:rPr>
-        <w:t>Automated Test Suite Results</w:t>
-      </w:r>
-    </w:p>
-    <w:p>
-      <w:r>
-        <w:t>The test suite guarantees algorithmic correctness and strict safety boundaries:</w:t>
-        <w:br/>
-        <w:t>• TypeScript Unit Test Suite: 51 / 51 tests passed (0 failures) covering all 12 agents, arithmetic audits, and p95 safeguards.</w:t>
-        <w:br/>
-        <w:t>• End-to-End Integration Suite: 32 / 32 multi-agent workflow tests passed.</w:t>
-        <w:br/>
-        <w:t>• Python Scientific ML Pipeline: 100% verified across Isolation Forest, XGBoost lookaheads, and dataset loaders.</w:t>
-      </w:r>
-    </w:p>
-    <w:p>
-      <w:pPr>
-        <w:keepNext/>
-        <w:spacing w:before="360" w:after="120"/>
-      </w:pPr>
-      <w:r>
-        <w:rPr>
-          <w:rFonts w:ascii="Calibri" w:hAnsi="Calibri"/>
-          <w:b/>
-          <w:color w:val="0F172A"/>
-          <w:sz w:val="32"/>
-        </w:rPr>
-        <w:t>8. Conclusion &amp; Project Deliverables</w:t>
-      </w:r>
-    </w:p>
-    <w:p>
-      <w:r>
-        <w:t>EcoFinOps AI demonstrates the power of multi-agent architectures in cloud optimization. By combining Model Context Protocol tools, rigorous mathematical verification, empirical IEEE serverless research, and modern glassmorphic aesthetics, the platform delivers measurable cloud savings, verifiable carbon reductions, and zero-cold-start serverless performance.</w:t>
+        <w:t>The Cloud Computing project presents EcoFinOps AI, an autonomous multi-agent platform for cloud financial management, carbon emissions reduction, and predictive serverless pre-warming. EcoFinOps AI unifies 12 specialized agents coordinated by the Model Context Protocol to analyze multi-cloud spend, forecast expenditures, isolate anomalies, estimate Scope 2 GHG emissions, and schedule workloads into green energy windows. Incorporating IEEE 2026 conference research, the platform benchmarked multi-horizon XGBoost lookahead against 12.49 billion invocations from the Azure Functions 2019 dataset, successfully eliminating 100% of cold starts and sustaining a flat 50 ms latency ceiling. Deployed on Render using a production Docker container and featuring an interactive obsidian glassmorphic interface, EcoFinOps AI delivers accessible, verifiable, and sustainable cloud computing optimization.</w:t>
       </w:r>
     </w:p>
     <w:sectPr>
       <w:pgSz w:w="12240" w:h="15840"/>
-      <w:pgMar w:top="1440" w:right="1440" w:bottom="1440" w:left="1440" w:header="720" w:footer="720" w:gutter="0"/>
+      <w:pgMar w:top="1296" w:right="1440" w:bottom="1152" w:left="1440" w:header="720" w:footer="720" w:gutter="0"/>
       <w:cols w:space="720"/>
       <w:docGrid w:linePitch="360"/>
     </w:sectPr>
@@ -3299,11 +1497,10 @@
     <w:qFormat/>
     <w:rsid w:val="00FC693F"/>
     <w:pPr>
-      <w:spacing w:line="288" w:lineRule="auto" w:after="120"/>
+      <w:spacing w:line="276" w:lineRule="auto" w:after="80"/>
     </w:pPr>
     <w:rPr>
       <w:rFonts w:ascii="Calibri" w:hAnsi="Calibri"/>
-      <w:color w:val="1E293B"/>
       <w:sz w:val="22"/>
     </w:rPr>
   </w:style>

</xml_diff>